<commit_message>
Build the strong foundation towards the Human frictions .
Co-Authored-By: jothish-blip <215570346+jothish-blip@users.noreply.github.com>
</commit_message>
<xml_diff>
--- a/docs/02-Publishing-Manual/📖 PROJECT UIL PUBLISHING MANUAL.docx
+++ b/docs/02-Publishing-Manual/📖 PROJECT UIL PUBLISHING MANUAL.docx
@@ -2,4029 +2,6 @@
 <file path=word/document.xml><?xml version="1.0" encoding="utf-8"?>
 <w:document xmlns:wpc="http://schemas.microsoft.com/office/word/2010/wordprocessingCanvas" xmlns:cx="http://schemas.microsoft.com/office/drawing/2014/chartex" xmlns:cx1="http://schemas.microsoft.com/office/drawing/2015/9/8/chartex" xmlns:cx2="http://schemas.microsoft.com/office/drawing/2015/10/21/chartex" xmlns:cx3="http://schemas.microsoft.com/office/drawing/2016/5/9/chartex" xmlns:cx4="http://schemas.microsoft.com/office/drawing/2016/5/10/chartex" xmlns:cx5="http://schemas.microsoft.com/office/drawing/2016/5/11/chartex" xmlns:cx6="http://schemas.microsoft.com/office/drawing/2016/5/12/chartex" xmlns:cx7="http://schemas.microsoft.com/office/drawing/2016/5/13/chartex" xmlns:cx8="http://schemas.microsoft.com/office/drawing/2016/5/14/chartex" xmlns:mc="http://schemas.openxmlformats.org/markup-compatibility/2006" xmlns:aink="http://schemas.microsoft.com/office/drawing/2016/ink" xmlns:am3d="http://schemas.microsoft.com/office/drawing/2017/model3d" xmlns:o="urn:schemas-microsoft-com:office:office" xmlns:oel="http://schemas.microsoft.com/office/2019/extlst" xmlns:r="http://schemas.openxmlformats.org/officeDocument/2006/relationships" xmlns:m="http://schemas.openxmlformats.org/officeDocument/2006/math" xmlns:v="urn:schemas-microsoft-com:vml" xmlns:wp14="http://schemas.microsoft.com/office/word/2010/wordprocessingDrawing" xmlns:wp="http://schemas.openxmlformats.org/drawingml/2006/wordprocessingDrawing" xmlns:w10="urn:schemas-microsoft-com:office:word" xmlns:w="http://schemas.openxmlformats.org/wordprocessingml/2006/main" xmlns:w14="http://schemas.microsoft.com/office/word/2010/wordml" xmlns:w15="http://schemas.microsoft.com/office/word/2012/wordml" xmlns:w16cex="http://schemas.microsoft.com/office/word/2018/wordml/cex" xmlns:w16cid="http://schemas.microsoft.com/office/word/2016/wordml/cid" xmlns:w16="http://schemas.microsoft.com/office/word/2018/wordml" xmlns:w16du="http://schemas.microsoft.com/office/word/2023/wordml/word16du" xmlns:w16sdtdh="http://schemas.microsoft.com/office/word/2020/wordml/sdtdatahash" xmlns:w16sdtfl="http://schemas.microsoft.com/office/word/2024/wordml/sdtformatlock" xmlns:w16se="http://schemas.microsoft.com/office/word/2015/wordml/symex" xmlns:wpg="http://schemas.microsoft.com/office/word/2010/wordprocessingGroup" xmlns:wpi="http://schemas.microsoft.com/office/word/2010/wordprocessingInk" xmlns:wne="http://schemas.microsoft.com/office/word/2006/wordml" xmlns:wps="http://schemas.microsoft.com/office/word/2010/wordprocessingShape" mc:Ignorable="w14 w15 w16se w16cid w16 w16cex w16sdtdh w16sdtfl w16du wp14">
   <w:body>
-    <w:p>
-      <w:pPr>
-        <w:rPr>
-          <w:rFonts w:ascii="Segoe UI Emoji" w:hAnsi="Segoe UI Emoji" w:cs="Segoe UI Emoji"/>
-          <w:b/>
-          <w:bCs/>
-        </w:rPr>
-      </w:pPr>
-      <w:r>
-        <w:rPr>
-          <w:rFonts w:ascii="Segoe UI Emoji" w:hAnsi="Segoe UI Emoji" w:cs="Segoe UI Emoji"/>
-          <w:b/>
-          <w:bCs/>
-        </w:rPr>
-        <w:t>📖 PROJECT UIL PUBLISHING MANUAL</w:t>
-      </w:r>
-    </w:p>
-    <w:p>
-      <w:pPr>
-        <w:rPr>
-          <w:rFonts w:ascii="Segoe UI Emoji" w:hAnsi="Segoe UI Emoji" w:cs="Segoe UI Emoji"/>
-          <w:b/>
-          <w:bCs/>
-        </w:rPr>
-      </w:pPr>
-      <w:r>
-        <w:rPr>
-          <w:rFonts w:ascii="Segoe UI Emoji" w:hAnsi="Segoe UI Emoji" w:cs="Segoe UI Emoji"/>
-          <w:b/>
-          <w:bCs/>
-        </w:rPr>
-        <w:t>Version 1.0</w:t>
-      </w:r>
-    </w:p>
-    <w:p>
-      <w:pPr>
-        <w:rPr>
-          <w:rFonts w:ascii="Segoe UI Emoji" w:hAnsi="Segoe UI Emoji" w:cs="Segoe UI Emoji"/>
-          <w:b/>
-          <w:bCs/>
-        </w:rPr>
-      </w:pPr>
-      <w:r>
-        <w:rPr>
-          <w:rFonts w:ascii="Segoe UI Emoji" w:hAnsi="Segoe UI Emoji" w:cs="Segoe UI Emoji"/>
-          <w:b/>
-          <w:bCs/>
-        </w:rPr>
-        <w:pict w14:anchorId="38B44135">
-          <v:rect id="_x0000_i1151" style="width:0;height:1.5pt" o:hralign="center" o:hrstd="t" o:hr="t" fillcolor="#a0a0a0" stroked="f"/>
-        </w:pict>
-      </w:r>
-    </w:p>
-    <w:p>
-      <w:pPr>
-        <w:rPr>
-          <w:rFonts w:ascii="Segoe UI Emoji" w:hAnsi="Segoe UI Emoji" w:cs="Segoe UI Emoji"/>
-          <w:b/>
-          <w:bCs/>
-        </w:rPr>
-      </w:pPr>
-      <w:r>
-        <w:rPr>
-          <w:rFonts w:ascii="Segoe UI Emoji" w:hAnsi="Segoe UI Emoji" w:cs="Segoe UI Emoji"/>
-          <w:b/>
-          <w:bCs/>
-        </w:rPr>
-        <w:t>1. Purpose</w:t>
-      </w:r>
-    </w:p>
-    <w:p>
-      <w:pPr>
-        <w:rPr>
-          <w:rFonts w:ascii="Segoe UI Emoji" w:hAnsi="Segoe UI Emoji" w:cs="Segoe UI Emoji"/>
-          <w:b/>
-          <w:bCs/>
-        </w:rPr>
-      </w:pPr>
-      <w:r>
-        <w:rPr>
-          <w:rFonts w:ascii="Segoe UI Emoji" w:hAnsi="Segoe UI Emoji" w:cs="Segoe UI Emoji"/>
-          <w:b/>
-          <w:bCs/>
-        </w:rPr>
-        <w:t>This manual defines the standards for publishing under the Project UIL brand.</w:t>
-      </w:r>
-    </w:p>
-    <w:p>
-      <w:pPr>
-        <w:rPr>
-          <w:rFonts w:ascii="Segoe UI Emoji" w:hAnsi="Segoe UI Emoji" w:cs="Segoe UI Emoji"/>
-          <w:b/>
-          <w:bCs/>
-        </w:rPr>
-      </w:pPr>
-      <w:r>
-        <w:rPr>
-          <w:rFonts w:ascii="Segoe UI Emoji" w:hAnsi="Segoe UI Emoji" w:cs="Segoe UI Emoji"/>
-          <w:b/>
-          <w:bCs/>
-        </w:rPr>
-        <w:t>Every post, article, image, comment, and public interaction must follow these guidelines.</w:t>
-      </w:r>
-    </w:p>
-    <w:p>
-      <w:pPr>
-        <w:rPr>
-          <w:rFonts w:ascii="Segoe UI Emoji" w:hAnsi="Segoe UI Emoji" w:cs="Segoe UI Emoji"/>
-          <w:b/>
-          <w:bCs/>
-        </w:rPr>
-      </w:pPr>
-      <w:r>
-        <w:rPr>
-          <w:rFonts w:ascii="Segoe UI Emoji" w:hAnsi="Segoe UI Emoji" w:cs="Segoe UI Emoji"/>
-          <w:b/>
-          <w:bCs/>
-        </w:rPr>
-        <w:t>The objective is to maintain consistency, credibility, and trust over the long term.</w:t>
-      </w:r>
-    </w:p>
-    <w:p>
-      <w:pPr>
-        <w:rPr>
-          <w:rFonts w:ascii="Segoe UI Emoji" w:hAnsi="Segoe UI Emoji" w:cs="Segoe UI Emoji"/>
-          <w:b/>
-          <w:bCs/>
-        </w:rPr>
-      </w:pPr>
-      <w:r>
-        <w:rPr>
-          <w:rFonts w:ascii="Segoe UI Emoji" w:hAnsi="Segoe UI Emoji" w:cs="Segoe UI Emoji"/>
-          <w:b/>
-          <w:bCs/>
-        </w:rPr>
-        <w:pict w14:anchorId="763665D8">
-          <v:rect id="_x0000_i1152" style="width:0;height:1.5pt" o:hralign="center" o:hrstd="t" o:hr="t" fillcolor="#a0a0a0" stroked="f"/>
-        </w:pict>
-      </w:r>
-    </w:p>
-    <w:p>
-      <w:pPr>
-        <w:rPr>
-          <w:rFonts w:ascii="Segoe UI Emoji" w:hAnsi="Segoe UI Emoji" w:cs="Segoe UI Emoji"/>
-          <w:b/>
-          <w:bCs/>
-        </w:rPr>
-      </w:pPr>
-      <w:r>
-        <w:rPr>
-          <w:rFonts w:ascii="Segoe UI Emoji" w:hAnsi="Segoe UI Emoji" w:cs="Segoe UI Emoji"/>
-          <w:b/>
-          <w:bCs/>
-        </w:rPr>
-        <w:t>2. Publishing Mission</w:t>
-      </w:r>
-    </w:p>
-    <w:p>
-      <w:pPr>
-        <w:rPr>
-          <w:rFonts w:ascii="Segoe UI Emoji" w:hAnsi="Segoe UI Emoji" w:cs="Segoe UI Emoji"/>
-          <w:b/>
-          <w:bCs/>
-        </w:rPr>
-      </w:pPr>
-      <w:r>
-        <w:rPr>
-          <w:rFonts w:ascii="Segoe UI Emoji" w:hAnsi="Segoe UI Emoji" w:cs="Segoe UI Emoji"/>
-          <w:b/>
-          <w:bCs/>
-        </w:rPr>
-        <w:t>Every publication must help achieve the mission:</w:t>
-      </w:r>
-    </w:p>
-    <w:p>
-      <w:pPr>
-        <w:rPr>
-          <w:rFonts w:ascii="Segoe UI Emoji" w:hAnsi="Segoe UI Emoji" w:cs="Segoe UI Emoji"/>
-          <w:b/>
-          <w:bCs/>
-        </w:rPr>
-      </w:pPr>
-      <w:r>
-        <w:rPr>
-          <w:rFonts w:ascii="Segoe UI Emoji" w:hAnsi="Segoe UI Emoji" w:cs="Segoe UI Emoji"/>
-          <w:b/>
-          <w:bCs/>
-        </w:rPr>
-        <w:t>Understand human problems before building technology.</w:t>
-      </w:r>
-    </w:p>
-    <w:p>
-      <w:pPr>
-        <w:rPr>
-          <w:rFonts w:ascii="Segoe UI Emoji" w:hAnsi="Segoe UI Emoji" w:cs="Segoe UI Emoji"/>
-          <w:b/>
-          <w:bCs/>
-        </w:rPr>
-      </w:pPr>
-      <w:r>
-        <w:rPr>
-          <w:rFonts w:ascii="Segoe UI Emoji" w:hAnsi="Segoe UI Emoji" w:cs="Segoe UI Emoji"/>
-          <w:b/>
-          <w:bCs/>
-        </w:rPr>
-        <w:t>If a post does not support this mission, it should not be published.</w:t>
-      </w:r>
-    </w:p>
-    <w:p>
-      <w:pPr>
-        <w:rPr>
-          <w:rFonts w:ascii="Segoe UI Emoji" w:hAnsi="Segoe UI Emoji" w:cs="Segoe UI Emoji"/>
-          <w:b/>
-          <w:bCs/>
-        </w:rPr>
-      </w:pPr>
-      <w:r>
-        <w:rPr>
-          <w:rFonts w:ascii="Segoe UI Emoji" w:hAnsi="Segoe UI Emoji" w:cs="Segoe UI Emoji"/>
-          <w:b/>
-          <w:bCs/>
-        </w:rPr>
-        <w:pict w14:anchorId="1FEDF646">
-          <v:rect id="_x0000_i1153" style="width:0;height:1.5pt" o:hralign="center" o:hrstd="t" o:hr="t" fillcolor="#a0a0a0" stroked="f"/>
-        </w:pict>
-      </w:r>
-    </w:p>
-    <w:p>
-      <w:pPr>
-        <w:rPr>
-          <w:rFonts w:ascii="Segoe UI Emoji" w:hAnsi="Segoe UI Emoji" w:cs="Segoe UI Emoji"/>
-          <w:b/>
-          <w:bCs/>
-        </w:rPr>
-      </w:pPr>
-      <w:r>
-        <w:rPr>
-          <w:rFonts w:ascii="Segoe UI Emoji" w:hAnsi="Segoe UI Emoji" w:cs="Segoe UI Emoji"/>
-          <w:b/>
-          <w:bCs/>
-        </w:rPr>
-        <w:t>3. Publishing Philosophy</w:t>
-      </w:r>
-    </w:p>
-    <w:p>
-      <w:pPr>
-        <w:rPr>
-          <w:rFonts w:ascii="Segoe UI Emoji" w:hAnsi="Segoe UI Emoji" w:cs="Segoe UI Emoji"/>
-          <w:b/>
-          <w:bCs/>
-        </w:rPr>
-      </w:pPr>
-      <w:r>
-        <w:rPr>
-          <w:rFonts w:ascii="Segoe UI Emoji" w:hAnsi="Segoe UI Emoji" w:cs="Segoe UI Emoji"/>
-          <w:b/>
-          <w:bCs/>
-        </w:rPr>
-        <w:t>Project UIL exists to document research—not to chase attention.</w:t>
-      </w:r>
-    </w:p>
-    <w:p>
-      <w:pPr>
-        <w:rPr>
-          <w:rFonts w:ascii="Segoe UI Emoji" w:hAnsi="Segoe UI Emoji" w:cs="Segoe UI Emoji"/>
-          <w:b/>
-          <w:bCs/>
-        </w:rPr>
-      </w:pPr>
-      <w:r>
-        <w:rPr>
-          <w:rFonts w:ascii="Segoe UI Emoji" w:hAnsi="Segoe UI Emoji" w:cs="Segoe UI Emoji"/>
-          <w:b/>
-          <w:bCs/>
-        </w:rPr>
-        <w:t>Publishing is a way to:</w:t>
-      </w:r>
-    </w:p>
-    <w:p>
-      <w:pPr>
-        <w:numPr>
-          <w:ilvl w:val="0"/>
-          <w:numId w:val="15"/>
-        </w:numPr>
-        <w:rPr>
-          <w:rFonts w:ascii="Segoe UI Emoji" w:hAnsi="Segoe UI Emoji" w:cs="Segoe UI Emoji"/>
-          <w:b/>
-          <w:bCs/>
-        </w:rPr>
-      </w:pPr>
-      <w:r>
-        <w:rPr>
-          <w:rFonts w:ascii="Segoe UI Emoji" w:hAnsi="Segoe UI Emoji" w:cs="Segoe UI Emoji"/>
-          <w:b/>
-          <w:bCs/>
-        </w:rPr>
-        <w:t xml:space="preserve">Document observations </w:t>
-      </w:r>
-    </w:p>
-    <w:p>
-      <w:pPr>
-        <w:numPr>
-          <w:ilvl w:val="0"/>
-          <w:numId w:val="15"/>
-        </w:numPr>
-        <w:rPr>
-          <w:rFonts w:ascii="Segoe UI Emoji" w:hAnsi="Segoe UI Emoji" w:cs="Segoe UI Emoji"/>
-          <w:b/>
-          <w:bCs/>
-        </w:rPr>
-      </w:pPr>
-      <w:r>
-        <w:rPr>
-          <w:rFonts w:ascii="Segoe UI Emoji" w:hAnsi="Segoe UI Emoji" w:cs="Segoe UI Emoji"/>
-          <w:b/>
-          <w:bCs/>
-        </w:rPr>
-        <w:t xml:space="preserve">Share research </w:t>
-      </w:r>
-    </w:p>
-    <w:p>
-      <w:pPr>
-        <w:numPr>
-          <w:ilvl w:val="0"/>
-          <w:numId w:val="15"/>
-        </w:numPr>
-        <w:rPr>
-          <w:rFonts w:ascii="Segoe UI Emoji" w:hAnsi="Segoe UI Emoji" w:cs="Segoe UI Emoji"/>
-          <w:b/>
-          <w:bCs/>
-        </w:rPr>
-      </w:pPr>
-      <w:r>
-        <w:rPr>
-          <w:rFonts w:ascii="Segoe UI Emoji" w:hAnsi="Segoe UI Emoji" w:cs="Segoe UI Emoji"/>
-          <w:b/>
-          <w:bCs/>
-        </w:rPr>
-        <w:t xml:space="preserve">Encourage thoughtful discussion </w:t>
-      </w:r>
-    </w:p>
-    <w:p>
-      <w:pPr>
-        <w:numPr>
-          <w:ilvl w:val="0"/>
-          <w:numId w:val="15"/>
-        </w:numPr>
-        <w:rPr>
-          <w:rFonts w:ascii="Segoe UI Emoji" w:hAnsi="Segoe UI Emoji" w:cs="Segoe UI Emoji"/>
-          <w:b/>
-          <w:bCs/>
-        </w:rPr>
-      </w:pPr>
-      <w:r>
-        <w:rPr>
-          <w:rFonts w:ascii="Segoe UI Emoji" w:hAnsi="Segoe UI Emoji" w:cs="Segoe UI Emoji"/>
-          <w:b/>
-          <w:bCs/>
-        </w:rPr>
-        <w:t xml:space="preserve">Learn from others </w:t>
-      </w:r>
-    </w:p>
-    <w:p>
-      <w:pPr>
-        <w:numPr>
-          <w:ilvl w:val="0"/>
-          <w:numId w:val="15"/>
-        </w:numPr>
-        <w:rPr>
-          <w:rFonts w:ascii="Segoe UI Emoji" w:hAnsi="Segoe UI Emoji" w:cs="Segoe UI Emoji"/>
-          <w:b/>
-          <w:bCs/>
-        </w:rPr>
-      </w:pPr>
-      <w:r>
-        <w:rPr>
-          <w:rFonts w:ascii="Segoe UI Emoji" w:hAnsi="Segoe UI Emoji" w:cs="Segoe UI Emoji"/>
-          <w:b/>
-          <w:bCs/>
-        </w:rPr>
-        <w:t xml:space="preserve">Improve understanding </w:t>
-      </w:r>
-    </w:p>
-    <w:p>
-      <w:pPr>
-        <w:rPr>
-          <w:rFonts w:ascii="Segoe UI Emoji" w:hAnsi="Segoe UI Emoji" w:cs="Segoe UI Emoji"/>
-          <w:b/>
-          <w:bCs/>
-        </w:rPr>
-      </w:pPr>
-      <w:r>
-        <w:rPr>
-          <w:rFonts w:ascii="Segoe UI Emoji" w:hAnsi="Segoe UI Emoji" w:cs="Segoe UI Emoji"/>
-          <w:b/>
-          <w:bCs/>
-        </w:rPr>
-        <w:t>Publishing is not for:</w:t>
-      </w:r>
-    </w:p>
-    <w:p>
-      <w:pPr>
-        <w:numPr>
-          <w:ilvl w:val="0"/>
-          <w:numId w:val="16"/>
-        </w:numPr>
-        <w:rPr>
-          <w:rFonts w:ascii="Segoe UI Emoji" w:hAnsi="Segoe UI Emoji" w:cs="Segoe UI Emoji"/>
-          <w:b/>
-          <w:bCs/>
-        </w:rPr>
-      </w:pPr>
-      <w:r>
-        <w:rPr>
-          <w:rFonts w:ascii="Segoe UI Emoji" w:hAnsi="Segoe UI Emoji" w:cs="Segoe UI Emoji"/>
-          <w:b/>
-          <w:bCs/>
-        </w:rPr>
-        <w:t xml:space="preserve">Going viral </w:t>
-      </w:r>
-    </w:p>
-    <w:p>
-      <w:pPr>
-        <w:numPr>
-          <w:ilvl w:val="0"/>
-          <w:numId w:val="16"/>
-        </w:numPr>
-        <w:rPr>
-          <w:rFonts w:ascii="Segoe UI Emoji" w:hAnsi="Segoe UI Emoji" w:cs="Segoe UI Emoji"/>
-          <w:b/>
-          <w:bCs/>
-        </w:rPr>
-      </w:pPr>
-      <w:r>
-        <w:rPr>
-          <w:rFonts w:ascii="Segoe UI Emoji" w:hAnsi="Segoe UI Emoji" w:cs="Segoe UI Emoji"/>
-          <w:b/>
-          <w:bCs/>
-        </w:rPr>
-        <w:t xml:space="preserve">Self-promotion </w:t>
-      </w:r>
-    </w:p>
-    <w:p>
-      <w:pPr>
-        <w:numPr>
-          <w:ilvl w:val="0"/>
-          <w:numId w:val="16"/>
-        </w:numPr>
-        <w:rPr>
-          <w:rFonts w:ascii="Segoe UI Emoji" w:hAnsi="Segoe UI Emoji" w:cs="Segoe UI Emoji"/>
-          <w:b/>
-          <w:bCs/>
-        </w:rPr>
-      </w:pPr>
-      <w:r>
-        <w:rPr>
-          <w:rFonts w:ascii="Segoe UI Emoji" w:hAnsi="Segoe UI Emoji" w:cs="Segoe UI Emoji"/>
-          <w:b/>
-          <w:bCs/>
-        </w:rPr>
-        <w:t xml:space="preserve">Showing expertise for its own sake </w:t>
-      </w:r>
-    </w:p>
-    <w:p>
-      <w:pPr>
-        <w:numPr>
-          <w:ilvl w:val="0"/>
-          <w:numId w:val="16"/>
-        </w:numPr>
-        <w:rPr>
-          <w:rFonts w:ascii="Segoe UI Emoji" w:hAnsi="Segoe UI Emoji" w:cs="Segoe UI Emoji"/>
-          <w:b/>
-          <w:bCs/>
-        </w:rPr>
-      </w:pPr>
-      <w:r>
-        <w:rPr>
-          <w:rFonts w:ascii="Segoe UI Emoji" w:hAnsi="Segoe UI Emoji" w:cs="Segoe UI Emoji"/>
-          <w:b/>
-          <w:bCs/>
-        </w:rPr>
-        <w:t xml:space="preserve">Following trends </w:t>
-      </w:r>
-    </w:p>
-    <w:p>
-      <w:pPr>
-        <w:rPr>
-          <w:rFonts w:ascii="Segoe UI Emoji" w:hAnsi="Segoe UI Emoji" w:cs="Segoe UI Emoji"/>
-          <w:b/>
-          <w:bCs/>
-        </w:rPr>
-      </w:pPr>
-      <w:r>
-        <w:rPr>
-          <w:rFonts w:ascii="Segoe UI Emoji" w:hAnsi="Segoe UI Emoji" w:cs="Segoe UI Emoji"/>
-          <w:b/>
-          <w:bCs/>
-        </w:rPr>
-        <w:pict w14:anchorId="070D9700">
-          <v:rect id="_x0000_i1154" style="width:0;height:1.5pt" o:hralign="center" o:hrstd="t" o:hr="t" fillcolor="#a0a0a0" stroked="f"/>
-        </w:pict>
-      </w:r>
-    </w:p>
-    <w:p>
-      <w:pPr>
-        <w:rPr>
-          <w:rFonts w:ascii="Segoe UI Emoji" w:hAnsi="Segoe UI Emoji" w:cs="Segoe UI Emoji"/>
-          <w:b/>
-          <w:bCs/>
-        </w:rPr>
-      </w:pPr>
-      <w:r>
-        <w:rPr>
-          <w:rFonts w:ascii="Segoe UI Emoji" w:hAnsi="Segoe UI Emoji" w:cs="Segoe UI Emoji"/>
-          <w:b/>
-          <w:bCs/>
-        </w:rPr>
-        <w:t>4. Content Categories</w:t>
-      </w:r>
-    </w:p>
-    <w:p>
-      <w:pPr>
-        <w:rPr>
-          <w:rFonts w:ascii="Segoe UI Emoji" w:hAnsi="Segoe UI Emoji" w:cs="Segoe UI Emoji"/>
-          <w:b/>
-          <w:bCs/>
-        </w:rPr>
-      </w:pPr>
-      <w:r>
-        <w:rPr>
-          <w:rFonts w:ascii="Segoe UI Emoji" w:hAnsi="Segoe UI Emoji" w:cs="Segoe UI Emoji"/>
-          <w:b/>
-          <w:bCs/>
-        </w:rPr>
-        <w:t>Every post must belong to one category.</w:t>
-      </w:r>
-    </w:p>
-    <w:tbl>
-      <w:tblPr>
-        <w:tblW w:w="0" w:type="auto"/>
-        <w:tblCellSpacing w:w="15" w:type="dxa"/>
-        <w:tblCellMar>
-          <w:top w:w="15" w:type="dxa"/>
-          <w:left w:w="15" w:type="dxa"/>
-          <w:bottom w:w="15" w:type="dxa"/>
-          <w:right w:w="15" w:type="dxa"/>
-        </w:tblCellMar>
-        <w:tblLook w:val="04A0" w:firstRow="1" w:lastRow="0" w:firstColumn="1" w:lastColumn="0" w:noHBand="0" w:noVBand="1"/>
-      </w:tblPr>
-      <w:tblGrid>
-        <w:gridCol w:w="632"/>
-        <w:gridCol w:w="2119"/>
-        <w:gridCol w:w="4711"/>
-      </w:tblGrid>
-      <w:tr>
-        <w:trPr>
-          <w:tblHeader/>
-          <w:tblCellSpacing w:w="15" w:type="dxa"/>
-        </w:trPr>
-        <w:tc>
-          <w:tcPr>
-            <w:tcW w:w="0" w:type="auto"/>
-            <w:vAlign w:val="center"/>
-            <w:hideMark/>
-          </w:tcPr>
-          <w:p>
-            <w:pPr>
-              <w:rPr>
-                <w:rFonts w:ascii="Segoe UI Emoji" w:hAnsi="Segoe UI Emoji" w:cs="Segoe UI Emoji"/>
-                <w:b/>
-                <w:bCs/>
-              </w:rPr>
-            </w:pPr>
-            <w:r>
-              <w:rPr>
-                <w:rFonts w:ascii="Segoe UI Emoji" w:hAnsi="Segoe UI Emoji" w:cs="Segoe UI Emoji"/>
-                <w:b/>
-                <w:bCs/>
-              </w:rPr>
-              <w:t>Code</w:t>
-            </w:r>
-          </w:p>
-        </w:tc>
-        <w:tc>
-          <w:tcPr>
-            <w:tcW w:w="0" w:type="auto"/>
-            <w:vAlign w:val="center"/>
-            <w:hideMark/>
-          </w:tcPr>
-          <w:p>
-            <w:pPr>
-              <w:rPr>
-                <w:rFonts w:ascii="Segoe UI Emoji" w:hAnsi="Segoe UI Emoji" w:cs="Segoe UI Emoji"/>
-                <w:b/>
-                <w:bCs/>
-              </w:rPr>
-            </w:pPr>
-            <w:r>
-              <w:rPr>
-                <w:rFonts w:ascii="Segoe UI Emoji" w:hAnsi="Segoe UI Emoji" w:cs="Segoe UI Emoji"/>
-                <w:b/>
-                <w:bCs/>
-              </w:rPr>
-              <w:t>Category</w:t>
-            </w:r>
-          </w:p>
-        </w:tc>
-        <w:tc>
-          <w:tcPr>
-            <w:tcW w:w="0" w:type="auto"/>
-            <w:vAlign w:val="center"/>
-            <w:hideMark/>
-          </w:tcPr>
-          <w:p>
-            <w:pPr>
-              <w:rPr>
-                <w:rFonts w:ascii="Segoe UI Emoji" w:hAnsi="Segoe UI Emoji" w:cs="Segoe UI Emoji"/>
-                <w:b/>
-                <w:bCs/>
-              </w:rPr>
-            </w:pPr>
-            <w:r>
-              <w:rPr>
-                <w:rFonts w:ascii="Segoe UI Emoji" w:hAnsi="Segoe UI Emoji" w:cs="Segoe UI Emoji"/>
-                <w:b/>
-                <w:bCs/>
-              </w:rPr>
-              <w:t>Purpose</w:t>
-            </w:r>
-          </w:p>
-        </w:tc>
-      </w:tr>
-      <w:tr>
-        <w:trPr>
-          <w:tblCellSpacing w:w="15" w:type="dxa"/>
-        </w:trPr>
-        <w:tc>
-          <w:tcPr>
-            <w:tcW w:w="0" w:type="auto"/>
-            <w:vAlign w:val="center"/>
-            <w:hideMark/>
-          </w:tcPr>
-          <w:p>
-            <w:pPr>
-              <w:rPr>
-                <w:rFonts w:ascii="Segoe UI Emoji" w:hAnsi="Segoe UI Emoji" w:cs="Segoe UI Emoji"/>
-                <w:b/>
-                <w:bCs/>
-              </w:rPr>
-            </w:pPr>
-            <w:r>
-              <w:rPr>
-                <w:rFonts w:ascii="Segoe UI Emoji" w:hAnsi="Segoe UI Emoji" w:cs="Segoe UI Emoji"/>
-                <w:b/>
-                <w:bCs/>
-              </w:rPr>
-              <w:t>AO</w:t>
-            </w:r>
-          </w:p>
-        </w:tc>
-        <w:tc>
-          <w:tcPr>
-            <w:tcW w:w="0" w:type="auto"/>
-            <w:vAlign w:val="center"/>
-            <w:hideMark/>
-          </w:tcPr>
-          <w:p>
-            <w:pPr>
-              <w:rPr>
-                <w:rFonts w:ascii="Segoe UI Emoji" w:hAnsi="Segoe UI Emoji" w:cs="Segoe UI Emoji"/>
-                <w:b/>
-                <w:bCs/>
-              </w:rPr>
-            </w:pPr>
-            <w:r>
-              <w:rPr>
-                <w:rFonts w:ascii="Segoe UI Emoji" w:hAnsi="Segoe UI Emoji" w:cs="Segoe UI Emoji"/>
-                <w:b/>
-                <w:bCs/>
-              </w:rPr>
-              <w:t>Atlas Observation</w:t>
-            </w:r>
-          </w:p>
-        </w:tc>
-        <w:tc>
-          <w:tcPr>
-            <w:tcW w:w="0" w:type="auto"/>
-            <w:vAlign w:val="center"/>
-            <w:hideMark/>
-          </w:tcPr>
-          <w:p>
-            <w:pPr>
-              <w:rPr>
-                <w:rFonts w:ascii="Segoe UI Emoji" w:hAnsi="Segoe UI Emoji" w:cs="Segoe UI Emoji"/>
-                <w:b/>
-                <w:bCs/>
-              </w:rPr>
-            </w:pPr>
-            <w:r>
-              <w:rPr>
-                <w:rFonts w:ascii="Segoe UI Emoji" w:hAnsi="Segoe UI Emoji" w:cs="Segoe UI Emoji"/>
-                <w:b/>
-                <w:bCs/>
-              </w:rPr>
-              <w:t>Share one Human Friction</w:t>
-            </w:r>
-          </w:p>
-        </w:tc>
-      </w:tr>
-      <w:tr>
-        <w:trPr>
-          <w:tblCellSpacing w:w="15" w:type="dxa"/>
-        </w:trPr>
-        <w:tc>
-          <w:tcPr>
-            <w:tcW w:w="0" w:type="auto"/>
-            <w:vAlign w:val="center"/>
-            <w:hideMark/>
-          </w:tcPr>
-          <w:p>
-            <w:pPr>
-              <w:rPr>
-                <w:rFonts w:ascii="Segoe UI Emoji" w:hAnsi="Segoe UI Emoji" w:cs="Segoe UI Emoji"/>
-                <w:b/>
-                <w:bCs/>
-              </w:rPr>
-            </w:pPr>
-            <w:r>
-              <w:rPr>
-                <w:rFonts w:ascii="Segoe UI Emoji" w:hAnsi="Segoe UI Emoji" w:cs="Segoe UI Emoji"/>
-                <w:b/>
-                <w:bCs/>
-              </w:rPr>
-              <w:t>RP</w:t>
-            </w:r>
-          </w:p>
-        </w:tc>
-        <w:tc>
-          <w:tcPr>
-            <w:tcW w:w="0" w:type="auto"/>
-            <w:vAlign w:val="center"/>
-            <w:hideMark/>
-          </w:tcPr>
-          <w:p>
-            <w:pPr>
-              <w:rPr>
-                <w:rFonts w:ascii="Segoe UI Emoji" w:hAnsi="Segoe UI Emoji" w:cs="Segoe UI Emoji"/>
-                <w:b/>
-                <w:bCs/>
-              </w:rPr>
-            </w:pPr>
-            <w:r>
-              <w:rPr>
-                <w:rFonts w:ascii="Segoe UI Emoji" w:hAnsi="Segoe UI Emoji" w:cs="Segoe UI Emoji"/>
-                <w:b/>
-                <w:bCs/>
-              </w:rPr>
-              <w:t>Research Pattern</w:t>
-            </w:r>
-          </w:p>
-        </w:tc>
-        <w:tc>
-          <w:tcPr>
-            <w:tcW w:w="0" w:type="auto"/>
-            <w:vAlign w:val="center"/>
-            <w:hideMark/>
-          </w:tcPr>
-          <w:p>
-            <w:pPr>
-              <w:rPr>
-                <w:rFonts w:ascii="Segoe UI Emoji" w:hAnsi="Segoe UI Emoji" w:cs="Segoe UI Emoji"/>
-                <w:b/>
-                <w:bCs/>
-              </w:rPr>
-            </w:pPr>
-            <w:r>
-              <w:rPr>
-                <w:rFonts w:ascii="Segoe UI Emoji" w:hAnsi="Segoe UI Emoji" w:cs="Segoe UI Emoji"/>
-                <w:b/>
-                <w:bCs/>
-              </w:rPr>
-              <w:t>Connect multiple observations</w:t>
-            </w:r>
-          </w:p>
-        </w:tc>
-      </w:tr>
-      <w:tr>
-        <w:trPr>
-          <w:tblCellSpacing w:w="15" w:type="dxa"/>
-        </w:trPr>
-        <w:tc>
-          <w:tcPr>
-            <w:tcW w:w="0" w:type="auto"/>
-            <w:vAlign w:val="center"/>
-            <w:hideMark/>
-          </w:tcPr>
-          <w:p>
-            <w:pPr>
-              <w:rPr>
-                <w:rFonts w:ascii="Segoe UI Emoji" w:hAnsi="Segoe UI Emoji" w:cs="Segoe UI Emoji"/>
-                <w:b/>
-                <w:bCs/>
-              </w:rPr>
-            </w:pPr>
-            <w:r>
-              <w:rPr>
-                <w:rFonts w:ascii="Segoe UI Emoji" w:hAnsi="Segoe UI Emoji" w:cs="Segoe UI Emoji"/>
-                <w:b/>
-                <w:bCs/>
-              </w:rPr>
-              <w:t>RJ</w:t>
-            </w:r>
-          </w:p>
-        </w:tc>
-        <w:tc>
-          <w:tcPr>
-            <w:tcW w:w="0" w:type="auto"/>
-            <w:vAlign w:val="center"/>
-            <w:hideMark/>
-          </w:tcPr>
-          <w:p>
-            <w:pPr>
-              <w:rPr>
-                <w:rFonts w:ascii="Segoe UI Emoji" w:hAnsi="Segoe UI Emoji" w:cs="Segoe UI Emoji"/>
-                <w:b/>
-                <w:bCs/>
-              </w:rPr>
-            </w:pPr>
-            <w:r>
-              <w:rPr>
-                <w:rFonts w:ascii="Segoe UI Emoji" w:hAnsi="Segoe UI Emoji" w:cs="Segoe UI Emoji"/>
-                <w:b/>
-                <w:bCs/>
-              </w:rPr>
-              <w:t>Research Journal</w:t>
-            </w:r>
-          </w:p>
-        </w:tc>
-        <w:tc>
-          <w:tcPr>
-            <w:tcW w:w="0" w:type="auto"/>
-            <w:vAlign w:val="center"/>
-            <w:hideMark/>
-          </w:tcPr>
-          <w:p>
-            <w:pPr>
-              <w:rPr>
-                <w:rFonts w:ascii="Segoe UI Emoji" w:hAnsi="Segoe UI Emoji" w:cs="Segoe UI Emoji"/>
-                <w:b/>
-                <w:bCs/>
-              </w:rPr>
-            </w:pPr>
-            <w:r>
-              <w:rPr>
-                <w:rFonts w:ascii="Segoe UI Emoji" w:hAnsi="Segoe UI Emoji" w:cs="Segoe UI Emoji"/>
-                <w:b/>
-                <w:bCs/>
-              </w:rPr>
-              <w:t>Weekly progress and reflections</w:t>
-            </w:r>
-          </w:p>
-        </w:tc>
-      </w:tr>
-      <w:tr>
-        <w:trPr>
-          <w:tblCellSpacing w:w="15" w:type="dxa"/>
-        </w:trPr>
-        <w:tc>
-          <w:tcPr>
-            <w:tcW w:w="0" w:type="auto"/>
-            <w:vAlign w:val="center"/>
-            <w:hideMark/>
-          </w:tcPr>
-          <w:p>
-            <w:pPr>
-              <w:rPr>
-                <w:rFonts w:ascii="Segoe UI Emoji" w:hAnsi="Segoe UI Emoji" w:cs="Segoe UI Emoji"/>
-                <w:b/>
-                <w:bCs/>
-              </w:rPr>
-            </w:pPr>
-            <w:r>
-              <w:rPr>
-                <w:rFonts w:ascii="Segoe UI Emoji" w:hAnsi="Segoe UI Emoji" w:cs="Segoe UI Emoji"/>
-                <w:b/>
-                <w:bCs/>
-              </w:rPr>
-              <w:t>HS</w:t>
-            </w:r>
-          </w:p>
-        </w:tc>
-        <w:tc>
-          <w:tcPr>
-            <w:tcW w:w="0" w:type="auto"/>
-            <w:vAlign w:val="center"/>
-            <w:hideMark/>
-          </w:tcPr>
-          <w:p>
-            <w:pPr>
-              <w:rPr>
-                <w:rFonts w:ascii="Segoe UI Emoji" w:hAnsi="Segoe UI Emoji" w:cs="Segoe UI Emoji"/>
-                <w:b/>
-                <w:bCs/>
-              </w:rPr>
-            </w:pPr>
-            <w:r>
-              <w:rPr>
-                <w:rFonts w:ascii="Segoe UI Emoji" w:hAnsi="Segoe UI Emoji" w:cs="Segoe UI Emoji"/>
-                <w:b/>
-                <w:bCs/>
-              </w:rPr>
-              <w:t>Human Story</w:t>
-            </w:r>
-          </w:p>
-        </w:tc>
-        <w:tc>
-          <w:tcPr>
-            <w:tcW w:w="0" w:type="auto"/>
-            <w:vAlign w:val="center"/>
-            <w:hideMark/>
-          </w:tcPr>
-          <w:p>
-            <w:pPr>
-              <w:rPr>
-                <w:rFonts w:ascii="Segoe UI Emoji" w:hAnsi="Segoe UI Emoji" w:cs="Segoe UI Emoji"/>
-                <w:b/>
-                <w:bCs/>
-              </w:rPr>
-            </w:pPr>
-            <w:r>
-              <w:rPr>
-                <w:rFonts w:ascii="Segoe UI Emoji" w:hAnsi="Segoe UI Emoji" w:cs="Segoe UI Emoji"/>
-                <w:b/>
-                <w:bCs/>
-              </w:rPr>
-              <w:t>Real-world experience that reveals a friction</w:t>
-            </w:r>
-          </w:p>
-        </w:tc>
-      </w:tr>
-      <w:tr>
-        <w:trPr>
-          <w:tblCellSpacing w:w="15" w:type="dxa"/>
-        </w:trPr>
-        <w:tc>
-          <w:tcPr>
-            <w:tcW w:w="0" w:type="auto"/>
-            <w:vAlign w:val="center"/>
-            <w:hideMark/>
-          </w:tcPr>
-          <w:p>
-            <w:pPr>
-              <w:rPr>
-                <w:rFonts w:ascii="Segoe UI Emoji" w:hAnsi="Segoe UI Emoji" w:cs="Segoe UI Emoji"/>
-                <w:b/>
-                <w:bCs/>
-              </w:rPr>
-            </w:pPr>
-            <w:r>
-              <w:rPr>
-                <w:rFonts w:ascii="Segoe UI Emoji" w:hAnsi="Segoe UI Emoji" w:cs="Segoe UI Emoji"/>
-                <w:b/>
-                <w:bCs/>
-              </w:rPr>
-              <w:t>ST</w:t>
-            </w:r>
-          </w:p>
-        </w:tc>
-        <w:tc>
-          <w:tcPr>
-            <w:tcW w:w="0" w:type="auto"/>
-            <w:vAlign w:val="center"/>
-            <w:hideMark/>
-          </w:tcPr>
-          <w:p>
-            <w:pPr>
-              <w:rPr>
-                <w:rFonts w:ascii="Segoe UI Emoji" w:hAnsi="Segoe UI Emoji" w:cs="Segoe UI Emoji"/>
-                <w:b/>
-                <w:bCs/>
-              </w:rPr>
-            </w:pPr>
-            <w:r>
-              <w:rPr>
-                <w:rFonts w:ascii="Segoe UI Emoji" w:hAnsi="Segoe UI Emoji" w:cs="Segoe UI Emoji"/>
-                <w:b/>
-                <w:bCs/>
-              </w:rPr>
-              <w:t>Systems Thinking</w:t>
-            </w:r>
-          </w:p>
-        </w:tc>
-        <w:tc>
-          <w:tcPr>
-            <w:tcW w:w="0" w:type="auto"/>
-            <w:vAlign w:val="center"/>
-            <w:hideMark/>
-          </w:tcPr>
-          <w:p>
-            <w:pPr>
-              <w:rPr>
-                <w:rFonts w:ascii="Segoe UI Emoji" w:hAnsi="Segoe UI Emoji" w:cs="Segoe UI Emoji"/>
-                <w:b/>
-                <w:bCs/>
-              </w:rPr>
-            </w:pPr>
-            <w:r>
-              <w:rPr>
-                <w:rFonts w:ascii="Segoe UI Emoji" w:hAnsi="Segoe UI Emoji" w:cs="Segoe UI Emoji"/>
-                <w:b/>
-                <w:bCs/>
-              </w:rPr>
-              <w:t>Explain broader systems or interactions</w:t>
-            </w:r>
-          </w:p>
-        </w:tc>
-      </w:tr>
-      <w:tr>
-        <w:trPr>
-          <w:tblCellSpacing w:w="15" w:type="dxa"/>
-        </w:trPr>
-        <w:tc>
-          <w:tcPr>
-            <w:tcW w:w="0" w:type="auto"/>
-            <w:vAlign w:val="center"/>
-            <w:hideMark/>
-          </w:tcPr>
-          <w:p>
-            <w:pPr>
-              <w:rPr>
-                <w:rFonts w:ascii="Segoe UI Emoji" w:hAnsi="Segoe UI Emoji" w:cs="Segoe UI Emoji"/>
-                <w:b/>
-                <w:bCs/>
-              </w:rPr>
-            </w:pPr>
-            <w:r>
-              <w:rPr>
-                <w:rFonts w:ascii="Segoe UI Emoji" w:hAnsi="Segoe UI Emoji" w:cs="Segoe UI Emoji"/>
-                <w:b/>
-                <w:bCs/>
-              </w:rPr>
-              <w:t>OQ</w:t>
-            </w:r>
-          </w:p>
-        </w:tc>
-        <w:tc>
-          <w:tcPr>
-            <w:tcW w:w="0" w:type="auto"/>
-            <w:vAlign w:val="center"/>
-            <w:hideMark/>
-          </w:tcPr>
-          <w:p>
-            <w:pPr>
-              <w:rPr>
-                <w:rFonts w:ascii="Segoe UI Emoji" w:hAnsi="Segoe UI Emoji" w:cs="Segoe UI Emoji"/>
-                <w:b/>
-                <w:bCs/>
-              </w:rPr>
-            </w:pPr>
-            <w:r>
-              <w:rPr>
-                <w:rFonts w:ascii="Segoe UI Emoji" w:hAnsi="Segoe UI Emoji" w:cs="Segoe UI Emoji"/>
-                <w:b/>
-                <w:bCs/>
-              </w:rPr>
-              <w:t>Open Question</w:t>
-            </w:r>
-          </w:p>
-        </w:tc>
-        <w:tc>
-          <w:tcPr>
-            <w:tcW w:w="0" w:type="auto"/>
-            <w:vAlign w:val="center"/>
-            <w:hideMark/>
-          </w:tcPr>
-          <w:p>
-            <w:pPr>
-              <w:rPr>
-                <w:rFonts w:ascii="Segoe UI Emoji" w:hAnsi="Segoe UI Emoji" w:cs="Segoe UI Emoji"/>
-                <w:b/>
-                <w:bCs/>
-              </w:rPr>
-            </w:pPr>
-            <w:r>
-              <w:rPr>
-                <w:rFonts w:ascii="Segoe UI Emoji" w:hAnsi="Segoe UI Emoji" w:cs="Segoe UI Emoji"/>
-                <w:b/>
-                <w:bCs/>
-              </w:rPr>
-              <w:t>Invite thoughtful discussion</w:t>
-            </w:r>
-          </w:p>
-        </w:tc>
-      </w:tr>
-      <w:tr>
-        <w:trPr>
-          <w:tblCellSpacing w:w="15" w:type="dxa"/>
-        </w:trPr>
-        <w:tc>
-          <w:tcPr>
-            <w:tcW w:w="0" w:type="auto"/>
-            <w:vAlign w:val="center"/>
-            <w:hideMark/>
-          </w:tcPr>
-          <w:p>
-            <w:pPr>
-              <w:rPr>
-                <w:rFonts w:ascii="Segoe UI Emoji" w:hAnsi="Segoe UI Emoji" w:cs="Segoe UI Emoji"/>
-                <w:b/>
-                <w:bCs/>
-              </w:rPr>
-            </w:pPr>
-            <w:r>
-              <w:rPr>
-                <w:rFonts w:ascii="Segoe UI Emoji" w:hAnsi="Segoe UI Emoji" w:cs="Segoe UI Emoji"/>
-                <w:b/>
-                <w:bCs/>
-              </w:rPr>
-              <w:t>RM</w:t>
-            </w:r>
-          </w:p>
-        </w:tc>
-        <w:tc>
-          <w:tcPr>
-            <w:tcW w:w="0" w:type="auto"/>
-            <w:vAlign w:val="center"/>
-            <w:hideMark/>
-          </w:tcPr>
-          <w:p>
-            <w:pPr>
-              <w:rPr>
-                <w:rFonts w:ascii="Segoe UI Emoji" w:hAnsi="Segoe UI Emoji" w:cs="Segoe UI Emoji"/>
-                <w:b/>
-                <w:bCs/>
-              </w:rPr>
-            </w:pPr>
-            <w:r>
-              <w:rPr>
-                <w:rFonts w:ascii="Segoe UI Emoji" w:hAnsi="Segoe UI Emoji" w:cs="Segoe UI Emoji"/>
-                <w:b/>
-                <w:bCs/>
-              </w:rPr>
-              <w:t>Research Milestone</w:t>
-            </w:r>
-          </w:p>
-        </w:tc>
-        <w:tc>
-          <w:tcPr>
-            <w:tcW w:w="0" w:type="auto"/>
-            <w:vAlign w:val="center"/>
-            <w:hideMark/>
-          </w:tcPr>
-          <w:p>
-            <w:pPr>
-              <w:rPr>
-                <w:rFonts w:ascii="Segoe UI Emoji" w:hAnsi="Segoe UI Emoji" w:cs="Segoe UI Emoji"/>
-                <w:b/>
-                <w:bCs/>
-              </w:rPr>
-            </w:pPr>
-            <w:r>
-              <w:rPr>
-                <w:rFonts w:ascii="Segoe UI Emoji" w:hAnsi="Segoe UI Emoji" w:cs="Segoe UI Emoji"/>
-                <w:b/>
-                <w:bCs/>
-              </w:rPr>
-              <w:t>Share meaningful project progress</w:t>
-            </w:r>
-          </w:p>
-        </w:tc>
-      </w:tr>
-    </w:tbl>
-    <w:p>
-      <w:pPr>
-        <w:rPr>
-          <w:rFonts w:ascii="Segoe UI Emoji" w:hAnsi="Segoe UI Emoji" w:cs="Segoe UI Emoji"/>
-          <w:b/>
-          <w:bCs/>
-        </w:rPr>
-      </w:pPr>
-      <w:r>
-        <w:rPr>
-          <w:rFonts w:ascii="Segoe UI Emoji" w:hAnsi="Segoe UI Emoji" w:cs="Segoe UI Emoji"/>
-          <w:b/>
-          <w:bCs/>
-        </w:rPr>
-        <w:t>Never publish a post that doesn't clearly fit one of these.</w:t>
-      </w:r>
-    </w:p>
-    <w:p>
-      <w:pPr>
-        <w:rPr>
-          <w:rFonts w:ascii="Segoe UI Emoji" w:hAnsi="Segoe UI Emoji" w:cs="Segoe UI Emoji"/>
-          <w:b/>
-          <w:bCs/>
-        </w:rPr>
-      </w:pPr>
-      <w:r>
-        <w:rPr>
-          <w:rFonts w:ascii="Segoe UI Emoji" w:hAnsi="Segoe UI Emoji" w:cs="Segoe UI Emoji"/>
-          <w:b/>
-          <w:bCs/>
-        </w:rPr>
-        <w:pict w14:anchorId="2F669DFD">
-          <v:rect id="_x0000_i1155" style="width:0;height:1.5pt" o:hralign="center" o:hrstd="t" o:hr="t" fillcolor="#a0a0a0" stroked="f"/>
-        </w:pict>
-      </w:r>
-    </w:p>
-    <w:p>
-      <w:pPr>
-        <w:rPr>
-          <w:rFonts w:ascii="Segoe UI Emoji" w:hAnsi="Segoe UI Emoji" w:cs="Segoe UI Emoji"/>
-          <w:b/>
-          <w:bCs/>
-        </w:rPr>
-      </w:pPr>
-      <w:r>
-        <w:rPr>
-          <w:rFonts w:ascii="Segoe UI Emoji" w:hAnsi="Segoe UI Emoji" w:cs="Segoe UI Emoji"/>
-          <w:b/>
-          <w:bCs/>
-        </w:rPr>
-        <w:t>5. Publishing Rules</w:t>
-      </w:r>
-    </w:p>
-    <w:p>
-      <w:pPr>
-        <w:rPr>
-          <w:rFonts w:ascii="Segoe UI Emoji" w:hAnsi="Segoe UI Emoji" w:cs="Segoe UI Emoji"/>
-          <w:b/>
-          <w:bCs/>
-        </w:rPr>
-      </w:pPr>
-      <w:r>
-        <w:rPr>
-          <w:rFonts w:ascii="Segoe UI Emoji" w:hAnsi="Segoe UI Emoji" w:cs="Segoe UI Emoji"/>
-          <w:b/>
-          <w:bCs/>
-        </w:rPr>
-        <w:t>Every post must:</w:t>
-      </w:r>
-    </w:p>
-    <w:p>
-      <w:pPr>
-        <w:numPr>
-          <w:ilvl w:val="0"/>
-          <w:numId w:val="17"/>
-        </w:numPr>
-        <w:rPr>
-          <w:rFonts w:ascii="Segoe UI Emoji" w:hAnsi="Segoe UI Emoji" w:cs="Segoe UI Emoji"/>
-          <w:b/>
-          <w:bCs/>
-        </w:rPr>
-      </w:pPr>
-      <w:r>
-        <w:rPr>
-          <w:rFonts w:ascii="Segoe UI Emoji" w:hAnsi="Segoe UI Emoji" w:cs="Segoe UI Emoji"/>
-          <w:b/>
-          <w:bCs/>
-        </w:rPr>
-        <w:t xml:space="preserve">Be based on observation, research, or a clearly stated question. </w:t>
-      </w:r>
-    </w:p>
-    <w:p>
-      <w:pPr>
-        <w:numPr>
-          <w:ilvl w:val="0"/>
-          <w:numId w:val="17"/>
-        </w:numPr>
-        <w:rPr>
-          <w:rFonts w:ascii="Segoe UI Emoji" w:hAnsi="Segoe UI Emoji" w:cs="Segoe UI Emoji"/>
-          <w:b/>
-          <w:bCs/>
-        </w:rPr>
-      </w:pPr>
-      <w:r>
-        <w:rPr>
-          <w:rFonts w:ascii="Segoe UI Emoji" w:hAnsi="Segoe UI Emoji" w:cs="Segoe UI Emoji"/>
-          <w:b/>
-          <w:bCs/>
-        </w:rPr>
-        <w:t xml:space="preserve">Be honest about what is known and what is still uncertain. </w:t>
-      </w:r>
-    </w:p>
-    <w:p>
-      <w:pPr>
-        <w:numPr>
-          <w:ilvl w:val="0"/>
-          <w:numId w:val="17"/>
-        </w:numPr>
-        <w:rPr>
-          <w:rFonts w:ascii="Segoe UI Emoji" w:hAnsi="Segoe UI Emoji" w:cs="Segoe UI Emoji"/>
-          <w:b/>
-          <w:bCs/>
-        </w:rPr>
-      </w:pPr>
-      <w:r>
-        <w:rPr>
-          <w:rFonts w:ascii="Segoe UI Emoji" w:hAnsi="Segoe UI Emoji" w:cs="Segoe UI Emoji"/>
-          <w:b/>
-          <w:bCs/>
-        </w:rPr>
-        <w:t xml:space="preserve">Respect people's privacy. </w:t>
-      </w:r>
-    </w:p>
-    <w:p>
-      <w:pPr>
-        <w:numPr>
-          <w:ilvl w:val="0"/>
-          <w:numId w:val="17"/>
-        </w:numPr>
-        <w:rPr>
-          <w:rFonts w:ascii="Segoe UI Emoji" w:hAnsi="Segoe UI Emoji" w:cs="Segoe UI Emoji"/>
-          <w:b/>
-          <w:bCs/>
-        </w:rPr>
-      </w:pPr>
-      <w:r>
-        <w:rPr>
-          <w:rFonts w:ascii="Segoe UI Emoji" w:hAnsi="Segoe UI Emoji" w:cs="Segoe UI Emoji"/>
-          <w:b/>
-          <w:bCs/>
-        </w:rPr>
-        <w:t xml:space="preserve">Avoid sensational language. </w:t>
-      </w:r>
-    </w:p>
-    <w:p>
-      <w:pPr>
-        <w:numPr>
-          <w:ilvl w:val="0"/>
-          <w:numId w:val="17"/>
-        </w:numPr>
-        <w:rPr>
-          <w:rFonts w:ascii="Segoe UI Emoji" w:hAnsi="Segoe UI Emoji" w:cs="Segoe UI Emoji"/>
-          <w:b/>
-          <w:bCs/>
-        </w:rPr>
-      </w:pPr>
-      <w:r>
-        <w:rPr>
-          <w:rFonts w:ascii="Segoe UI Emoji" w:hAnsi="Segoe UI Emoji" w:cs="Segoe UI Emoji"/>
-          <w:b/>
-          <w:bCs/>
-        </w:rPr>
-        <w:t xml:space="preserve">End with a purpose (insight, reflection, or question). </w:t>
-      </w:r>
-    </w:p>
-    <w:p>
-      <w:pPr>
-        <w:rPr>
-          <w:rFonts w:ascii="Segoe UI Emoji" w:hAnsi="Segoe UI Emoji" w:cs="Segoe UI Emoji"/>
-          <w:b/>
-          <w:bCs/>
-        </w:rPr>
-      </w:pPr>
-      <w:r>
-        <w:rPr>
-          <w:rFonts w:ascii="Segoe UI Emoji" w:hAnsi="Segoe UI Emoji" w:cs="Segoe UI Emoji"/>
-          <w:b/>
-          <w:bCs/>
-        </w:rPr>
-        <w:pict w14:anchorId="0EC7B53A">
-          <v:rect id="_x0000_i1156" style="width:0;height:1.5pt" o:hralign="center" o:hrstd="t" o:hr="t" fillcolor="#a0a0a0" stroked="f"/>
-        </w:pict>
-      </w:r>
-    </w:p>
-    <w:p>
-      <w:pPr>
-        <w:rPr>
-          <w:rFonts w:ascii="Segoe UI Emoji" w:hAnsi="Segoe UI Emoji" w:cs="Segoe UI Emoji"/>
-          <w:b/>
-          <w:bCs/>
-        </w:rPr>
-      </w:pPr>
-      <w:r>
-        <w:rPr>
-          <w:rFonts w:ascii="Segoe UI Emoji" w:hAnsi="Segoe UI Emoji" w:cs="Segoe UI Emoji"/>
-          <w:b/>
-          <w:bCs/>
-        </w:rPr>
-        <w:t>6. Writing Style</w:t>
-      </w:r>
-    </w:p>
-    <w:p>
-      <w:pPr>
-        <w:rPr>
-          <w:rFonts w:ascii="Segoe UI Emoji" w:hAnsi="Segoe UI Emoji" w:cs="Segoe UI Emoji"/>
-          <w:b/>
-          <w:bCs/>
-        </w:rPr>
-      </w:pPr>
-      <w:r>
-        <w:rPr>
-          <w:rFonts w:ascii="Segoe UI Emoji" w:hAnsi="Segoe UI Emoji" w:cs="Segoe UI Emoji"/>
-          <w:b/>
-          <w:bCs/>
-        </w:rPr>
-        <w:t>Every post should follow this structure:</w:t>
-      </w:r>
-    </w:p>
-    <w:p>
-      <w:pPr>
-        <w:rPr>
-          <w:rFonts w:ascii="Segoe UI Emoji" w:hAnsi="Segoe UI Emoji" w:cs="Segoe UI Emoji"/>
-          <w:b/>
-          <w:bCs/>
-        </w:rPr>
-      </w:pPr>
-      <w:r>
-        <w:rPr>
-          <w:rFonts w:ascii="Segoe UI Emoji" w:hAnsi="Segoe UI Emoji" w:cs="Segoe UI Emoji"/>
-          <w:b/>
-          <w:bCs/>
-        </w:rPr>
-        <w:t>1. Hook</w:t>
-      </w:r>
-    </w:p>
-    <w:p>
-      <w:pPr>
-        <w:rPr>
-          <w:rFonts w:ascii="Segoe UI Emoji" w:hAnsi="Segoe UI Emoji" w:cs="Segoe UI Emoji"/>
-          <w:b/>
-          <w:bCs/>
-        </w:rPr>
-      </w:pPr>
-      <w:r>
-        <w:rPr>
-          <w:rFonts w:ascii="Segoe UI Emoji" w:hAnsi="Segoe UI Emoji" w:cs="Segoe UI Emoji"/>
-          <w:b/>
-          <w:bCs/>
-        </w:rPr>
-        <w:t>One sentence that introduces the observation or idea.</w:t>
-      </w:r>
-    </w:p>
-    <w:p>
-      <w:pPr>
-        <w:rPr>
-          <w:rFonts w:ascii="Segoe UI Emoji" w:hAnsi="Segoe UI Emoji" w:cs="Segoe UI Emoji"/>
-          <w:b/>
-          <w:bCs/>
-        </w:rPr>
-      </w:pPr>
-      <w:r>
-        <w:rPr>
-          <w:rFonts w:ascii="Segoe UI Emoji" w:hAnsi="Segoe UI Emoji" w:cs="Segoe UI Emoji"/>
-          <w:b/>
-          <w:bCs/>
-        </w:rPr>
-        <w:t>2. Context</w:t>
-      </w:r>
-    </w:p>
-    <w:p>
-      <w:pPr>
-        <w:rPr>
-          <w:rFonts w:ascii="Segoe UI Emoji" w:hAnsi="Segoe UI Emoji" w:cs="Segoe UI Emoji"/>
-          <w:b/>
-          <w:bCs/>
-        </w:rPr>
-      </w:pPr>
-      <w:r>
-        <w:rPr>
-          <w:rFonts w:ascii="Segoe UI Emoji" w:hAnsi="Segoe UI Emoji" w:cs="Segoe UI Emoji"/>
-          <w:b/>
-          <w:bCs/>
-        </w:rPr>
-        <w:t>Explain what was observed.</w:t>
-      </w:r>
-    </w:p>
-    <w:p>
-      <w:pPr>
-        <w:rPr>
-          <w:rFonts w:ascii="Segoe UI Emoji" w:hAnsi="Segoe UI Emoji" w:cs="Segoe UI Emoji"/>
-          <w:b/>
-          <w:bCs/>
-        </w:rPr>
-      </w:pPr>
-      <w:r>
-        <w:rPr>
-          <w:rFonts w:ascii="Segoe UI Emoji" w:hAnsi="Segoe UI Emoji" w:cs="Segoe UI Emoji"/>
-          <w:b/>
-          <w:bCs/>
-        </w:rPr>
-        <w:t>3. Insight</w:t>
-      </w:r>
-    </w:p>
-    <w:p>
-      <w:pPr>
-        <w:rPr>
-          <w:rFonts w:ascii="Segoe UI Emoji" w:hAnsi="Segoe UI Emoji" w:cs="Segoe UI Emoji"/>
-          <w:b/>
-          <w:bCs/>
-        </w:rPr>
-      </w:pPr>
-      <w:r>
-        <w:rPr>
-          <w:rFonts w:ascii="Segoe UI Emoji" w:hAnsi="Segoe UI Emoji" w:cs="Segoe UI Emoji"/>
-          <w:b/>
-          <w:bCs/>
-        </w:rPr>
-        <w:t>Why does this matter?</w:t>
-      </w:r>
-    </w:p>
-    <w:p>
-      <w:pPr>
-        <w:rPr>
-          <w:rFonts w:ascii="Segoe UI Emoji" w:hAnsi="Segoe UI Emoji" w:cs="Segoe UI Emoji"/>
-          <w:b/>
-          <w:bCs/>
-        </w:rPr>
-      </w:pPr>
-      <w:r>
-        <w:rPr>
-          <w:rFonts w:ascii="Segoe UI Emoji" w:hAnsi="Segoe UI Emoji" w:cs="Segoe UI Emoji"/>
-          <w:b/>
-          <w:bCs/>
-        </w:rPr>
-        <w:t>4. Reflection</w:t>
-      </w:r>
-    </w:p>
-    <w:p>
-      <w:pPr>
-        <w:rPr>
-          <w:rFonts w:ascii="Segoe UI Emoji" w:hAnsi="Segoe UI Emoji" w:cs="Segoe UI Emoji"/>
-          <w:b/>
-          <w:bCs/>
-        </w:rPr>
-      </w:pPr>
-      <w:r>
-        <w:rPr>
-          <w:rFonts w:ascii="Segoe UI Emoji" w:hAnsi="Segoe UI Emoji" w:cs="Segoe UI Emoji"/>
-          <w:b/>
-          <w:bCs/>
-        </w:rPr>
-        <w:t>What does this reveal about people or systems?</w:t>
-      </w:r>
-    </w:p>
-    <w:p>
-      <w:pPr>
-        <w:rPr>
-          <w:rFonts w:ascii="Segoe UI Emoji" w:hAnsi="Segoe UI Emoji" w:cs="Segoe UI Emoji"/>
-          <w:b/>
-          <w:bCs/>
-        </w:rPr>
-      </w:pPr>
-      <w:r>
-        <w:rPr>
-          <w:rFonts w:ascii="Segoe UI Emoji" w:hAnsi="Segoe UI Emoji" w:cs="Segoe UI Emoji"/>
-          <w:b/>
-          <w:bCs/>
-        </w:rPr>
-        <w:t>5. Closing</w:t>
-      </w:r>
-    </w:p>
-    <w:p>
-      <w:pPr>
-        <w:rPr>
-          <w:rFonts w:ascii="Segoe UI Emoji" w:hAnsi="Segoe UI Emoji" w:cs="Segoe UI Emoji"/>
-          <w:b/>
-          <w:bCs/>
-        </w:rPr>
-      </w:pPr>
-      <w:r>
-        <w:rPr>
-          <w:rFonts w:ascii="Segoe UI Emoji" w:hAnsi="Segoe UI Emoji" w:cs="Segoe UI Emoji"/>
-          <w:b/>
-          <w:bCs/>
-        </w:rPr>
-        <w:t>A thoughtful question or concluding insight.</w:t>
-      </w:r>
-    </w:p>
-    <w:p>
-      <w:pPr>
-        <w:rPr>
-          <w:rFonts w:ascii="Segoe UI Emoji" w:hAnsi="Segoe UI Emoji" w:cs="Segoe UI Emoji"/>
-          <w:b/>
-          <w:bCs/>
-        </w:rPr>
-      </w:pPr>
-      <w:r>
-        <w:rPr>
-          <w:rFonts w:ascii="Segoe UI Emoji" w:hAnsi="Segoe UI Emoji" w:cs="Segoe UI Emoji"/>
-          <w:b/>
-          <w:bCs/>
-        </w:rPr>
-        <w:pict w14:anchorId="1E801C08">
-          <v:rect id="_x0000_i1157" style="width:0;height:1.5pt" o:hralign="center" o:hrstd="t" o:hr="t" fillcolor="#a0a0a0" stroked="f"/>
-        </w:pict>
-      </w:r>
-    </w:p>
-    <w:p>
-      <w:pPr>
-        <w:rPr>
-          <w:rFonts w:ascii="Segoe UI Emoji" w:hAnsi="Segoe UI Emoji" w:cs="Segoe UI Emoji"/>
-          <w:b/>
-          <w:bCs/>
-        </w:rPr>
-      </w:pPr>
-      <w:r>
-        <w:rPr>
-          <w:rFonts w:ascii="Segoe UI Emoji" w:hAnsi="Segoe UI Emoji" w:cs="Segoe UI Emoji"/>
-          <w:b/>
-          <w:bCs/>
-        </w:rPr>
-        <w:t>7. Tone of Voice</w:t>
-      </w:r>
-    </w:p>
-    <w:p>
-      <w:pPr>
-        <w:rPr>
-          <w:rFonts w:ascii="Segoe UI Emoji" w:hAnsi="Segoe UI Emoji" w:cs="Segoe UI Emoji"/>
-          <w:b/>
-          <w:bCs/>
-        </w:rPr>
-      </w:pPr>
-      <w:r>
-        <w:rPr>
-          <w:rFonts w:ascii="Segoe UI Emoji" w:hAnsi="Segoe UI Emoji" w:cs="Segoe UI Emoji"/>
-          <w:b/>
-          <w:bCs/>
-        </w:rPr>
-        <w:t>Every piece of writing should be:</w:t>
-      </w:r>
-    </w:p>
-    <w:p>
-      <w:pPr>
-        <w:numPr>
-          <w:ilvl w:val="0"/>
-          <w:numId w:val="18"/>
-        </w:numPr>
-        <w:rPr>
-          <w:rFonts w:ascii="Segoe UI Emoji" w:hAnsi="Segoe UI Emoji" w:cs="Segoe UI Emoji"/>
-          <w:b/>
-          <w:bCs/>
-        </w:rPr>
-      </w:pPr>
-      <w:r>
-        <w:rPr>
-          <w:rFonts w:ascii="Segoe UI Emoji" w:hAnsi="Segoe UI Emoji" w:cs="Segoe UI Emoji"/>
-          <w:b/>
-          <w:bCs/>
-        </w:rPr>
-        <w:t xml:space="preserve">Calm </w:t>
-      </w:r>
-    </w:p>
-    <w:p>
-      <w:pPr>
-        <w:numPr>
-          <w:ilvl w:val="0"/>
-          <w:numId w:val="18"/>
-        </w:numPr>
-        <w:rPr>
-          <w:rFonts w:ascii="Segoe UI Emoji" w:hAnsi="Segoe UI Emoji" w:cs="Segoe UI Emoji"/>
-          <w:b/>
-          <w:bCs/>
-        </w:rPr>
-      </w:pPr>
-      <w:r>
-        <w:rPr>
-          <w:rFonts w:ascii="Segoe UI Emoji" w:hAnsi="Segoe UI Emoji" w:cs="Segoe UI Emoji"/>
-          <w:b/>
-          <w:bCs/>
-        </w:rPr>
-        <w:t xml:space="preserve">Curious </w:t>
-      </w:r>
-    </w:p>
-    <w:p>
-      <w:pPr>
-        <w:numPr>
-          <w:ilvl w:val="0"/>
-          <w:numId w:val="18"/>
-        </w:numPr>
-        <w:rPr>
-          <w:rFonts w:ascii="Segoe UI Emoji" w:hAnsi="Segoe UI Emoji" w:cs="Segoe UI Emoji"/>
-          <w:b/>
-          <w:bCs/>
-        </w:rPr>
-      </w:pPr>
-      <w:r>
-        <w:rPr>
-          <w:rFonts w:ascii="Segoe UI Emoji" w:hAnsi="Segoe UI Emoji" w:cs="Segoe UI Emoji"/>
-          <w:b/>
-          <w:bCs/>
-        </w:rPr>
-        <w:t xml:space="preserve">Respectful </w:t>
-      </w:r>
-    </w:p>
-    <w:p>
-      <w:pPr>
-        <w:numPr>
-          <w:ilvl w:val="0"/>
-          <w:numId w:val="18"/>
-        </w:numPr>
-        <w:rPr>
-          <w:rFonts w:ascii="Segoe UI Emoji" w:hAnsi="Segoe UI Emoji" w:cs="Segoe UI Emoji"/>
-          <w:b/>
-          <w:bCs/>
-        </w:rPr>
-      </w:pPr>
-      <w:r>
-        <w:rPr>
-          <w:rFonts w:ascii="Segoe UI Emoji" w:hAnsi="Segoe UI Emoji" w:cs="Segoe UI Emoji"/>
-          <w:b/>
-          <w:bCs/>
-        </w:rPr>
-        <w:t xml:space="preserve">Precise </w:t>
-      </w:r>
-    </w:p>
-    <w:p>
-      <w:pPr>
-        <w:numPr>
-          <w:ilvl w:val="0"/>
-          <w:numId w:val="18"/>
-        </w:numPr>
-        <w:rPr>
-          <w:rFonts w:ascii="Segoe UI Emoji" w:hAnsi="Segoe UI Emoji" w:cs="Segoe UI Emoji"/>
-          <w:b/>
-          <w:bCs/>
-        </w:rPr>
-      </w:pPr>
-      <w:r>
-        <w:rPr>
-          <w:rFonts w:ascii="Segoe UI Emoji" w:hAnsi="Segoe UI Emoji" w:cs="Segoe UI Emoji"/>
-          <w:b/>
-          <w:bCs/>
-        </w:rPr>
-        <w:t xml:space="preserve">Thoughtful </w:t>
-      </w:r>
-    </w:p>
-    <w:p>
-      <w:pPr>
-        <w:numPr>
-          <w:ilvl w:val="0"/>
-          <w:numId w:val="18"/>
-        </w:numPr>
-        <w:rPr>
-          <w:rFonts w:ascii="Segoe UI Emoji" w:hAnsi="Segoe UI Emoji" w:cs="Segoe UI Emoji"/>
-          <w:b/>
-          <w:bCs/>
-        </w:rPr>
-      </w:pPr>
-      <w:r>
-        <w:rPr>
-          <w:rFonts w:ascii="Segoe UI Emoji" w:hAnsi="Segoe UI Emoji" w:cs="Segoe UI Emoji"/>
-          <w:b/>
-          <w:bCs/>
-        </w:rPr>
-        <w:t xml:space="preserve">Accessible </w:t>
-      </w:r>
-    </w:p>
-    <w:p>
-      <w:pPr>
-        <w:rPr>
-          <w:rFonts w:ascii="Segoe UI Emoji" w:hAnsi="Segoe UI Emoji" w:cs="Segoe UI Emoji"/>
-          <w:b/>
-          <w:bCs/>
-        </w:rPr>
-      </w:pPr>
-      <w:r>
-        <w:rPr>
-          <w:rFonts w:ascii="Segoe UI Emoji" w:hAnsi="Segoe UI Emoji" w:cs="Segoe UI Emoji"/>
-          <w:b/>
-          <w:bCs/>
-        </w:rPr>
-        <w:t>Avoid:</w:t>
-      </w:r>
-    </w:p>
-    <w:p>
-      <w:pPr>
-        <w:numPr>
-          <w:ilvl w:val="0"/>
-          <w:numId w:val="19"/>
-        </w:numPr>
-        <w:rPr>
-          <w:rFonts w:ascii="Segoe UI Emoji" w:hAnsi="Segoe UI Emoji" w:cs="Segoe UI Emoji"/>
-          <w:b/>
-          <w:bCs/>
-        </w:rPr>
-      </w:pPr>
-      <w:r>
-        <w:rPr>
-          <w:rFonts w:ascii="Segoe UI Emoji" w:hAnsi="Segoe UI Emoji" w:cs="Segoe UI Emoji"/>
-          <w:b/>
-          <w:bCs/>
-        </w:rPr>
-        <w:t xml:space="preserve">Clickbait </w:t>
-      </w:r>
-    </w:p>
-    <w:p>
-      <w:pPr>
-        <w:numPr>
-          <w:ilvl w:val="0"/>
-          <w:numId w:val="19"/>
-        </w:numPr>
-        <w:rPr>
-          <w:rFonts w:ascii="Segoe UI Emoji" w:hAnsi="Segoe UI Emoji" w:cs="Segoe UI Emoji"/>
-          <w:b/>
-          <w:bCs/>
-        </w:rPr>
-      </w:pPr>
-      <w:r>
-        <w:rPr>
-          <w:rFonts w:ascii="Segoe UI Emoji" w:hAnsi="Segoe UI Emoji" w:cs="Segoe UI Emoji"/>
-          <w:b/>
-          <w:bCs/>
-        </w:rPr>
-        <w:t xml:space="preserve">Hype </w:t>
-      </w:r>
-    </w:p>
-    <w:p>
-      <w:pPr>
-        <w:numPr>
-          <w:ilvl w:val="0"/>
-          <w:numId w:val="19"/>
-        </w:numPr>
-        <w:rPr>
-          <w:rFonts w:ascii="Segoe UI Emoji" w:hAnsi="Segoe UI Emoji" w:cs="Segoe UI Emoji"/>
-          <w:b/>
-          <w:bCs/>
-        </w:rPr>
-      </w:pPr>
-      <w:r>
-        <w:rPr>
-          <w:rFonts w:ascii="Segoe UI Emoji" w:hAnsi="Segoe UI Emoji" w:cs="Segoe UI Emoji"/>
-          <w:b/>
-          <w:bCs/>
-        </w:rPr>
-        <w:t xml:space="preserve">Mockery </w:t>
-      </w:r>
-    </w:p>
-    <w:p>
-      <w:pPr>
-        <w:numPr>
-          <w:ilvl w:val="0"/>
-          <w:numId w:val="19"/>
-        </w:numPr>
-        <w:rPr>
-          <w:rFonts w:ascii="Segoe UI Emoji" w:hAnsi="Segoe UI Emoji" w:cs="Segoe UI Emoji"/>
-          <w:b/>
-          <w:bCs/>
-        </w:rPr>
-      </w:pPr>
-      <w:r>
-        <w:rPr>
-          <w:rFonts w:ascii="Segoe UI Emoji" w:hAnsi="Segoe UI Emoji" w:cs="Segoe UI Emoji"/>
-          <w:b/>
-          <w:bCs/>
-        </w:rPr>
-        <w:t xml:space="preserve">Overconfidence </w:t>
-      </w:r>
-    </w:p>
-    <w:p>
-      <w:pPr>
-        <w:numPr>
-          <w:ilvl w:val="0"/>
-          <w:numId w:val="19"/>
-        </w:numPr>
-        <w:rPr>
-          <w:rFonts w:ascii="Segoe UI Emoji" w:hAnsi="Segoe UI Emoji" w:cs="Segoe UI Emoji"/>
-          <w:b/>
-          <w:bCs/>
-        </w:rPr>
-      </w:pPr>
-      <w:r>
-        <w:rPr>
-          <w:rFonts w:ascii="Segoe UI Emoji" w:hAnsi="Segoe UI Emoji" w:cs="Segoe UI Emoji"/>
-          <w:b/>
-          <w:bCs/>
-        </w:rPr>
-        <w:t xml:space="preserve">Excessive emojis </w:t>
-      </w:r>
-    </w:p>
-    <w:p>
-      <w:pPr>
-        <w:numPr>
-          <w:ilvl w:val="0"/>
-          <w:numId w:val="19"/>
-        </w:numPr>
-        <w:rPr>
-          <w:rFonts w:ascii="Segoe UI Emoji" w:hAnsi="Segoe UI Emoji" w:cs="Segoe UI Emoji"/>
-          <w:b/>
-          <w:bCs/>
-        </w:rPr>
-      </w:pPr>
-      <w:r>
-        <w:rPr>
-          <w:rFonts w:ascii="Segoe UI Emoji" w:hAnsi="Segoe UI Emoji" w:cs="Segoe UI Emoji"/>
-          <w:b/>
-          <w:bCs/>
-        </w:rPr>
-        <w:t xml:space="preserve">ALL CAPS for emphasis </w:t>
-      </w:r>
-    </w:p>
-    <w:p>
-      <w:pPr>
-        <w:rPr>
-          <w:rFonts w:ascii="Segoe UI Emoji" w:hAnsi="Segoe UI Emoji" w:cs="Segoe UI Emoji"/>
-          <w:b/>
-          <w:bCs/>
-        </w:rPr>
-      </w:pPr>
-      <w:r>
-        <w:rPr>
-          <w:rFonts w:ascii="Segoe UI Emoji" w:hAnsi="Segoe UI Emoji" w:cs="Segoe UI Emoji"/>
-          <w:b/>
-          <w:bCs/>
-        </w:rPr>
-        <w:pict w14:anchorId="33C02DF5">
-          <v:rect id="_x0000_i1158" style="width:0;height:1.5pt" o:hralign="center" o:hrstd="t" o:hr="t" fillcolor="#a0a0a0" stroked="f"/>
-        </w:pict>
-      </w:r>
-    </w:p>
-    <w:p>
-      <w:pPr>
-        <w:rPr>
-          <w:rFonts w:ascii="Segoe UI Emoji" w:hAnsi="Segoe UI Emoji" w:cs="Segoe UI Emoji"/>
-          <w:b/>
-          <w:bCs/>
-        </w:rPr>
-      </w:pPr>
-      <w:r>
-        <w:rPr>
-          <w:rFonts w:ascii="Segoe UI Emoji" w:hAnsi="Segoe UI Emoji" w:cs="Segoe UI Emoji"/>
-          <w:b/>
-          <w:bCs/>
-        </w:rPr>
-        <w:t>8. Image Standards</w:t>
-      </w:r>
-    </w:p>
-    <w:p>
-      <w:pPr>
-        <w:rPr>
-          <w:rFonts w:ascii="Segoe UI Emoji" w:hAnsi="Segoe UI Emoji" w:cs="Segoe UI Emoji"/>
-          <w:b/>
-          <w:bCs/>
-        </w:rPr>
-      </w:pPr>
-      <w:r>
-        <w:rPr>
-          <w:rFonts w:ascii="Segoe UI Emoji" w:hAnsi="Segoe UI Emoji" w:cs="Segoe UI Emoji"/>
-          <w:b/>
-          <w:bCs/>
-        </w:rPr>
-        <w:t>Every image should follow the Brand Book.</w:t>
-      </w:r>
-    </w:p>
-    <w:p>
-      <w:pPr>
-        <w:rPr>
-          <w:rFonts w:ascii="Segoe UI Emoji" w:hAnsi="Segoe UI Emoji" w:cs="Segoe UI Emoji"/>
-          <w:b/>
-          <w:bCs/>
-        </w:rPr>
-      </w:pPr>
-      <w:r>
-        <w:rPr>
-          <w:rFonts w:ascii="Segoe UI Emoji" w:hAnsi="Segoe UI Emoji" w:cs="Segoe UI Emoji"/>
-          <w:b/>
-          <w:bCs/>
-        </w:rPr>
-        <w:t>Requirements:</w:t>
-      </w:r>
-    </w:p>
-    <w:p>
-      <w:pPr>
-        <w:numPr>
-          <w:ilvl w:val="0"/>
-          <w:numId w:val="20"/>
-        </w:numPr>
-        <w:rPr>
-          <w:rFonts w:ascii="Segoe UI Emoji" w:hAnsi="Segoe UI Emoji" w:cs="Segoe UI Emoji"/>
-          <w:b/>
-          <w:bCs/>
-        </w:rPr>
-      </w:pPr>
-      <w:r>
-        <w:rPr>
-          <w:rFonts w:ascii="Segoe UI Emoji" w:hAnsi="Segoe UI Emoji" w:cs="Segoe UI Emoji"/>
-          <w:b/>
-          <w:bCs/>
-        </w:rPr>
-        <w:t xml:space="preserve">Matte black background </w:t>
-      </w:r>
-    </w:p>
-    <w:p>
-      <w:pPr>
-        <w:numPr>
-          <w:ilvl w:val="0"/>
-          <w:numId w:val="20"/>
-        </w:numPr>
-        <w:rPr>
-          <w:rFonts w:ascii="Segoe UI Emoji" w:hAnsi="Segoe UI Emoji" w:cs="Segoe UI Emoji"/>
-          <w:b/>
-          <w:bCs/>
-        </w:rPr>
-      </w:pPr>
-      <w:r>
-        <w:rPr>
-          <w:rFonts w:ascii="Segoe UI Emoji" w:hAnsi="Segoe UI Emoji" w:cs="Segoe UI Emoji"/>
-          <w:b/>
-          <w:bCs/>
-        </w:rPr>
-        <w:t xml:space="preserve">White typography </w:t>
-      </w:r>
-    </w:p>
-    <w:p>
-      <w:pPr>
-        <w:numPr>
-          <w:ilvl w:val="0"/>
-          <w:numId w:val="20"/>
-        </w:numPr>
-        <w:rPr>
-          <w:rFonts w:ascii="Segoe UI Emoji" w:hAnsi="Segoe UI Emoji" w:cs="Segoe UI Emoji"/>
-          <w:b/>
-          <w:bCs/>
-        </w:rPr>
-      </w:pPr>
-      <w:r>
-        <w:rPr>
-          <w:rFonts w:ascii="Segoe UI Emoji" w:hAnsi="Segoe UI Emoji" w:cs="Segoe UI Emoji"/>
-          <w:b/>
-          <w:bCs/>
-        </w:rPr>
-        <w:t xml:space="preserve">Emerald green accent </w:t>
-      </w:r>
-    </w:p>
-    <w:p>
-      <w:pPr>
-        <w:numPr>
-          <w:ilvl w:val="0"/>
-          <w:numId w:val="20"/>
-        </w:numPr>
-        <w:rPr>
-          <w:rFonts w:ascii="Segoe UI Emoji" w:hAnsi="Segoe UI Emoji" w:cs="Segoe UI Emoji"/>
-          <w:b/>
-          <w:bCs/>
-        </w:rPr>
-      </w:pPr>
-      <w:r>
-        <w:rPr>
-          <w:rFonts w:ascii="Segoe UI Emoji" w:hAnsi="Segoe UI Emoji" w:cs="Segoe UI Emoji"/>
-          <w:b/>
-          <w:bCs/>
-        </w:rPr>
-        <w:t xml:space="preserve">Minimal layout </w:t>
-      </w:r>
-    </w:p>
-    <w:p>
-      <w:pPr>
-        <w:numPr>
-          <w:ilvl w:val="0"/>
-          <w:numId w:val="20"/>
-        </w:numPr>
-        <w:rPr>
-          <w:rFonts w:ascii="Segoe UI Emoji" w:hAnsi="Segoe UI Emoji" w:cs="Segoe UI Emoji"/>
-          <w:b/>
-          <w:bCs/>
-        </w:rPr>
-      </w:pPr>
-      <w:r>
-        <w:rPr>
-          <w:rFonts w:ascii="Segoe UI Emoji" w:hAnsi="Segoe UI Emoji" w:cs="Segoe UI Emoji"/>
-          <w:b/>
-          <w:bCs/>
-        </w:rPr>
-        <w:t xml:space="preserve">Consistent fonts </w:t>
-      </w:r>
-    </w:p>
-    <w:p>
-      <w:pPr>
-        <w:numPr>
-          <w:ilvl w:val="0"/>
-          <w:numId w:val="20"/>
-        </w:numPr>
-        <w:rPr>
-          <w:rFonts w:ascii="Segoe UI Emoji" w:hAnsi="Segoe UI Emoji" w:cs="Segoe UI Emoji"/>
-          <w:b/>
-          <w:bCs/>
-        </w:rPr>
-      </w:pPr>
-      <w:r>
-        <w:rPr>
-          <w:rFonts w:ascii="Segoe UI Emoji" w:hAnsi="Segoe UI Emoji" w:cs="Segoe UI Emoji"/>
-          <w:b/>
-          <w:bCs/>
-        </w:rPr>
-        <w:t xml:space="preserve">Plenty of whitespace </w:t>
-      </w:r>
-    </w:p>
-    <w:p>
-      <w:pPr>
-        <w:rPr>
-          <w:rFonts w:ascii="Segoe UI Emoji" w:hAnsi="Segoe UI Emoji" w:cs="Segoe UI Emoji"/>
-          <w:b/>
-          <w:bCs/>
-        </w:rPr>
-      </w:pPr>
-      <w:r>
-        <w:rPr>
-          <w:rFonts w:ascii="Segoe UI Emoji" w:hAnsi="Segoe UI Emoji" w:cs="Segoe UI Emoji"/>
-          <w:b/>
-          <w:bCs/>
-        </w:rPr>
-        <w:t>Do not use:</w:t>
-      </w:r>
-    </w:p>
-    <w:p>
-      <w:pPr>
-        <w:numPr>
-          <w:ilvl w:val="0"/>
-          <w:numId w:val="21"/>
-        </w:numPr>
-        <w:rPr>
-          <w:rFonts w:ascii="Segoe UI Emoji" w:hAnsi="Segoe UI Emoji" w:cs="Segoe UI Emoji"/>
-          <w:b/>
-          <w:bCs/>
-        </w:rPr>
-      </w:pPr>
-      <w:r>
-        <w:rPr>
-          <w:rFonts w:ascii="Segoe UI Emoji" w:hAnsi="Segoe UI Emoji" w:cs="Segoe UI Emoji"/>
-          <w:b/>
-          <w:bCs/>
-        </w:rPr>
-        <w:t xml:space="preserve">AI clichés </w:t>
-      </w:r>
-    </w:p>
-    <w:p>
-      <w:pPr>
-        <w:numPr>
-          <w:ilvl w:val="0"/>
-          <w:numId w:val="21"/>
-        </w:numPr>
-        <w:rPr>
-          <w:rFonts w:ascii="Segoe UI Emoji" w:hAnsi="Segoe UI Emoji" w:cs="Segoe UI Emoji"/>
-          <w:b/>
-          <w:bCs/>
-        </w:rPr>
-      </w:pPr>
-      <w:r>
-        <w:rPr>
-          <w:rFonts w:ascii="Segoe UI Emoji" w:hAnsi="Segoe UI Emoji" w:cs="Segoe UI Emoji"/>
-          <w:b/>
-          <w:bCs/>
-        </w:rPr>
-        <w:t xml:space="preserve">Busy graphics </w:t>
-      </w:r>
-    </w:p>
-    <w:p>
-      <w:pPr>
-        <w:numPr>
-          <w:ilvl w:val="0"/>
-          <w:numId w:val="21"/>
-        </w:numPr>
-        <w:rPr>
-          <w:rFonts w:ascii="Segoe UI Emoji" w:hAnsi="Segoe UI Emoji" w:cs="Segoe UI Emoji"/>
-          <w:b/>
-          <w:bCs/>
-        </w:rPr>
-      </w:pPr>
-      <w:r>
-        <w:rPr>
-          <w:rFonts w:ascii="Segoe UI Emoji" w:hAnsi="Segoe UI Emoji" w:cs="Segoe UI Emoji"/>
-          <w:b/>
-          <w:bCs/>
-        </w:rPr>
-        <w:t xml:space="preserve">Decorative effects that distract from the message </w:t>
-      </w:r>
-    </w:p>
-    <w:p>
-      <w:pPr>
-        <w:rPr>
-          <w:rFonts w:ascii="Segoe UI Emoji" w:hAnsi="Segoe UI Emoji" w:cs="Segoe UI Emoji"/>
-          <w:b/>
-          <w:bCs/>
-        </w:rPr>
-      </w:pPr>
-      <w:r>
-        <w:rPr>
-          <w:rFonts w:ascii="Segoe UI Emoji" w:hAnsi="Segoe UI Emoji" w:cs="Segoe UI Emoji"/>
-          <w:b/>
-          <w:bCs/>
-        </w:rPr>
-        <w:pict w14:anchorId="6EAFDBAE">
-          <v:rect id="_x0000_i1159" style="width:0;height:1.5pt" o:hralign="center" o:hrstd="t" o:hr="t" fillcolor="#a0a0a0" stroked="f"/>
-        </w:pict>
-      </w:r>
-    </w:p>
-    <w:p>
-      <w:pPr>
-        <w:rPr>
-          <w:rFonts w:ascii="Segoe UI Emoji" w:hAnsi="Segoe UI Emoji" w:cs="Segoe UI Emoji"/>
-          <w:b/>
-          <w:bCs/>
-        </w:rPr>
-      </w:pPr>
-      <w:r>
-        <w:rPr>
-          <w:rFonts w:ascii="Segoe UI Emoji" w:hAnsi="Segoe UI Emoji" w:cs="Segoe UI Emoji"/>
-          <w:b/>
-          <w:bCs/>
-        </w:rPr>
-        <w:t>9. Quality Checklist</w:t>
-      </w:r>
-    </w:p>
-    <w:p>
-      <w:pPr>
-        <w:rPr>
-          <w:rFonts w:ascii="Segoe UI Emoji" w:hAnsi="Segoe UI Emoji" w:cs="Segoe UI Emoji"/>
-          <w:b/>
-          <w:bCs/>
-        </w:rPr>
-      </w:pPr>
-      <w:r>
-        <w:rPr>
-          <w:rFonts w:ascii="Segoe UI Emoji" w:hAnsi="Segoe UI Emoji" w:cs="Segoe UI Emoji"/>
-          <w:b/>
-          <w:bCs/>
-        </w:rPr>
-        <w:t>Before publishing, ask:</w:t>
-      </w:r>
-    </w:p>
-    <w:p>
-      <w:pPr>
-        <w:numPr>
-          <w:ilvl w:val="0"/>
-          <w:numId w:val="22"/>
-        </w:numPr>
-        <w:rPr>
-          <w:rFonts w:ascii="Segoe UI Emoji" w:hAnsi="Segoe UI Emoji" w:cs="Segoe UI Emoji"/>
-          <w:b/>
-          <w:bCs/>
-        </w:rPr>
-      </w:pPr>
-      <w:r>
-        <w:rPr>
-          <w:rFonts w:ascii="Segoe UI Emoji" w:hAnsi="Segoe UI Emoji" w:cs="Segoe UI Emoji"/>
-          <w:b/>
-          <w:bCs/>
-        </w:rPr>
-        <w:t xml:space="preserve">Is the observation genuine? </w:t>
-      </w:r>
-    </w:p>
-    <w:p>
-      <w:pPr>
-        <w:numPr>
-          <w:ilvl w:val="0"/>
-          <w:numId w:val="22"/>
-        </w:numPr>
-        <w:rPr>
-          <w:rFonts w:ascii="Segoe UI Emoji" w:hAnsi="Segoe UI Emoji" w:cs="Segoe UI Emoji"/>
-          <w:b/>
-          <w:bCs/>
-        </w:rPr>
-      </w:pPr>
-      <w:r>
-        <w:rPr>
-          <w:rFonts w:ascii="Segoe UI Emoji" w:hAnsi="Segoe UI Emoji" w:cs="Segoe UI Emoji"/>
-          <w:b/>
-          <w:bCs/>
-        </w:rPr>
-        <w:t xml:space="preserve">Is the wording clear? </w:t>
-      </w:r>
-    </w:p>
-    <w:p>
-      <w:pPr>
-        <w:numPr>
-          <w:ilvl w:val="0"/>
-          <w:numId w:val="22"/>
-        </w:numPr>
-        <w:rPr>
-          <w:rFonts w:ascii="Segoe UI Emoji" w:hAnsi="Segoe UI Emoji" w:cs="Segoe UI Emoji"/>
-          <w:b/>
-          <w:bCs/>
-        </w:rPr>
-      </w:pPr>
-      <w:r>
-        <w:rPr>
-          <w:rFonts w:ascii="Segoe UI Emoji" w:hAnsi="Segoe UI Emoji" w:cs="Segoe UI Emoji"/>
-          <w:b/>
-          <w:bCs/>
-        </w:rPr>
-        <w:t xml:space="preserve">Does it align with the mission? </w:t>
-      </w:r>
-    </w:p>
-    <w:p>
-      <w:pPr>
-        <w:numPr>
-          <w:ilvl w:val="0"/>
-          <w:numId w:val="22"/>
-        </w:numPr>
-        <w:rPr>
-          <w:rFonts w:ascii="Segoe UI Emoji" w:hAnsi="Segoe UI Emoji" w:cs="Segoe UI Emoji"/>
-          <w:b/>
-          <w:bCs/>
-        </w:rPr>
-      </w:pPr>
-      <w:r>
-        <w:rPr>
-          <w:rFonts w:ascii="Segoe UI Emoji" w:hAnsi="Segoe UI Emoji" w:cs="Segoe UI Emoji"/>
-          <w:b/>
-          <w:bCs/>
-        </w:rPr>
-        <w:t xml:space="preserve">Is the information accurate? </w:t>
-      </w:r>
-    </w:p>
-    <w:p>
-      <w:pPr>
-        <w:numPr>
-          <w:ilvl w:val="0"/>
-          <w:numId w:val="22"/>
-        </w:numPr>
-        <w:rPr>
-          <w:rFonts w:ascii="Segoe UI Emoji" w:hAnsi="Segoe UI Emoji" w:cs="Segoe UI Emoji"/>
-          <w:b/>
-          <w:bCs/>
-        </w:rPr>
-      </w:pPr>
-      <w:r>
-        <w:rPr>
-          <w:rFonts w:ascii="Segoe UI Emoji" w:hAnsi="Segoe UI Emoji" w:cs="Segoe UI Emoji"/>
-          <w:b/>
-          <w:bCs/>
-        </w:rPr>
-        <w:t xml:space="preserve">Is the image consistent with the brand? </w:t>
-      </w:r>
-    </w:p>
-    <w:p>
-      <w:pPr>
-        <w:numPr>
-          <w:ilvl w:val="0"/>
-          <w:numId w:val="22"/>
-        </w:numPr>
-        <w:rPr>
-          <w:rFonts w:ascii="Segoe UI Emoji" w:hAnsi="Segoe UI Emoji" w:cs="Segoe UI Emoji"/>
-          <w:b/>
-          <w:bCs/>
-        </w:rPr>
-      </w:pPr>
-      <w:r>
-        <w:rPr>
-          <w:rFonts w:ascii="Segoe UI Emoji" w:hAnsi="Segoe UI Emoji" w:cs="Segoe UI Emoji"/>
-          <w:b/>
-          <w:bCs/>
-        </w:rPr>
-        <w:t xml:space="preserve">Does the post encourage thoughtful discussion? </w:t>
-      </w:r>
-    </w:p>
-    <w:p>
-      <w:pPr>
-        <w:rPr>
-          <w:rFonts w:ascii="Segoe UI Emoji" w:hAnsi="Segoe UI Emoji" w:cs="Segoe UI Emoji"/>
-          <w:b/>
-          <w:bCs/>
-        </w:rPr>
-      </w:pPr>
-      <w:r>
-        <w:rPr>
-          <w:rFonts w:ascii="Segoe UI Emoji" w:hAnsi="Segoe UI Emoji" w:cs="Segoe UI Emoji"/>
-          <w:b/>
-          <w:bCs/>
-        </w:rPr>
-        <w:t>If any answer is "No", revise before publishing.</w:t>
-      </w:r>
-    </w:p>
-    <w:p>
-      <w:pPr>
-        <w:rPr>
-          <w:rFonts w:ascii="Segoe UI Emoji" w:hAnsi="Segoe UI Emoji" w:cs="Segoe UI Emoji"/>
-          <w:b/>
-          <w:bCs/>
-        </w:rPr>
-      </w:pPr>
-      <w:r>
-        <w:rPr>
-          <w:rFonts w:ascii="Segoe UI Emoji" w:hAnsi="Segoe UI Emoji" w:cs="Segoe UI Emoji"/>
-          <w:b/>
-          <w:bCs/>
-        </w:rPr>
-        <w:pict w14:anchorId="6B8B8D95">
-          <v:rect id="_x0000_i1160" style="width:0;height:1.5pt" o:hralign="center" o:hrstd="t" o:hr="t" fillcolor="#a0a0a0" stroked="f"/>
-        </w:pict>
-      </w:r>
-    </w:p>
-    <w:p>
-      <w:pPr>
-        <w:rPr>
-          <w:rFonts w:ascii="Segoe UI Emoji" w:hAnsi="Segoe UI Emoji" w:cs="Segoe UI Emoji"/>
-          <w:b/>
-          <w:bCs/>
-        </w:rPr>
-      </w:pPr>
-      <w:r>
-        <w:rPr>
-          <w:rFonts w:ascii="Segoe UI Emoji" w:hAnsi="Segoe UI Emoji" w:cs="Segoe UI Emoji"/>
-          <w:b/>
-          <w:bCs/>
-        </w:rPr>
-        <w:t>10. Research Ethics</w:t>
-      </w:r>
-    </w:p>
-    <w:p>
-      <w:pPr>
-        <w:rPr>
-          <w:rFonts w:ascii="Segoe UI Emoji" w:hAnsi="Segoe UI Emoji" w:cs="Segoe UI Emoji"/>
-          <w:b/>
-          <w:bCs/>
-        </w:rPr>
-      </w:pPr>
-      <w:r>
-        <w:rPr>
-          <w:rFonts w:ascii="Segoe UI Emoji" w:hAnsi="Segoe UI Emoji" w:cs="Segoe UI Emoji"/>
-          <w:b/>
-          <w:bCs/>
-        </w:rPr>
-        <w:t>Project UIL will:</w:t>
-      </w:r>
-    </w:p>
-    <w:p>
-      <w:pPr>
-        <w:numPr>
-          <w:ilvl w:val="0"/>
-          <w:numId w:val="23"/>
-        </w:numPr>
-        <w:rPr>
-          <w:rFonts w:ascii="Segoe UI Emoji" w:hAnsi="Segoe UI Emoji" w:cs="Segoe UI Emoji"/>
-          <w:b/>
-          <w:bCs/>
-        </w:rPr>
-      </w:pPr>
-      <w:r>
-        <w:rPr>
-          <w:rFonts w:ascii="Segoe UI Emoji" w:hAnsi="Segoe UI Emoji" w:cs="Segoe UI Emoji"/>
-          <w:b/>
-          <w:bCs/>
-        </w:rPr>
-        <w:t xml:space="preserve">Distinguish observations from hypotheses. </w:t>
-      </w:r>
-    </w:p>
-    <w:p>
-      <w:pPr>
-        <w:numPr>
-          <w:ilvl w:val="0"/>
-          <w:numId w:val="23"/>
-        </w:numPr>
-        <w:rPr>
-          <w:rFonts w:ascii="Segoe UI Emoji" w:hAnsi="Segoe UI Emoji" w:cs="Segoe UI Emoji"/>
-          <w:b/>
-          <w:bCs/>
-        </w:rPr>
-      </w:pPr>
-      <w:r>
-        <w:rPr>
-          <w:rFonts w:ascii="Segoe UI Emoji" w:hAnsi="Segoe UI Emoji" w:cs="Segoe UI Emoji"/>
-          <w:b/>
-          <w:bCs/>
-        </w:rPr>
-        <w:t xml:space="preserve">Credit external ideas and sources where used. </w:t>
-      </w:r>
-    </w:p>
-    <w:p>
-      <w:pPr>
-        <w:numPr>
-          <w:ilvl w:val="0"/>
-          <w:numId w:val="23"/>
-        </w:numPr>
-        <w:rPr>
-          <w:rFonts w:ascii="Segoe UI Emoji" w:hAnsi="Segoe UI Emoji" w:cs="Segoe UI Emoji"/>
-          <w:b/>
-          <w:bCs/>
-        </w:rPr>
-      </w:pPr>
-      <w:r>
-        <w:rPr>
-          <w:rFonts w:ascii="Segoe UI Emoji" w:hAnsi="Segoe UI Emoji" w:cs="Segoe UI Emoji"/>
-          <w:b/>
-          <w:bCs/>
-        </w:rPr>
-        <w:t xml:space="preserve">Respect privacy when describing real experiences. </w:t>
-      </w:r>
-    </w:p>
-    <w:p>
-      <w:pPr>
-        <w:numPr>
-          <w:ilvl w:val="0"/>
-          <w:numId w:val="23"/>
-        </w:numPr>
-        <w:rPr>
-          <w:rFonts w:ascii="Segoe UI Emoji" w:hAnsi="Segoe UI Emoji" w:cs="Segoe UI Emoji"/>
-          <w:b/>
-          <w:bCs/>
-        </w:rPr>
-      </w:pPr>
-      <w:r>
-        <w:rPr>
-          <w:rFonts w:ascii="Segoe UI Emoji" w:hAnsi="Segoe UI Emoji" w:cs="Segoe UI Emoji"/>
-          <w:b/>
-          <w:bCs/>
-        </w:rPr>
-        <w:t xml:space="preserve">Avoid presenting assumptions as facts. </w:t>
-      </w:r>
-    </w:p>
-    <w:p>
-      <w:pPr>
-        <w:numPr>
-          <w:ilvl w:val="0"/>
-          <w:numId w:val="23"/>
-        </w:numPr>
-        <w:rPr>
-          <w:rFonts w:ascii="Segoe UI Emoji" w:hAnsi="Segoe UI Emoji" w:cs="Segoe UI Emoji"/>
-          <w:b/>
-          <w:bCs/>
-        </w:rPr>
-      </w:pPr>
-      <w:r>
-        <w:rPr>
-          <w:rFonts w:ascii="Segoe UI Emoji" w:hAnsi="Segoe UI Emoji" w:cs="Segoe UI Emoji"/>
-          <w:b/>
-          <w:bCs/>
-        </w:rPr>
-        <w:t xml:space="preserve">Update or correct posts if new evidence changes the understanding. </w:t>
-      </w:r>
-    </w:p>
-    <w:p>
-      <w:pPr>
-        <w:rPr>
-          <w:rFonts w:ascii="Segoe UI Emoji" w:hAnsi="Segoe UI Emoji" w:cs="Segoe UI Emoji"/>
-          <w:b/>
-          <w:bCs/>
-        </w:rPr>
-      </w:pPr>
-      <w:r>
-        <w:rPr>
-          <w:rFonts w:ascii="Segoe UI Emoji" w:hAnsi="Segoe UI Emoji" w:cs="Segoe UI Emoji"/>
-          <w:b/>
-          <w:bCs/>
-        </w:rPr>
-        <w:pict w14:anchorId="63C37235">
-          <v:rect id="_x0000_i1161" style="width:0;height:1.5pt" o:hralign="center" o:hrstd="t" o:hr="t" fillcolor="#a0a0a0" stroked="f"/>
-        </w:pict>
-      </w:r>
-    </w:p>
-    <w:p>
-      <w:pPr>
-        <w:rPr>
-          <w:rFonts w:ascii="Segoe UI Emoji" w:hAnsi="Segoe UI Emoji" w:cs="Segoe UI Emoji"/>
-          <w:b/>
-          <w:bCs/>
-        </w:rPr>
-      </w:pPr>
-      <w:r>
-        <w:rPr>
-          <w:rFonts w:ascii="Segoe UI Emoji" w:hAnsi="Segoe UI Emoji" w:cs="Segoe UI Emoji"/>
-          <w:b/>
-          <w:bCs/>
-        </w:rPr>
-        <w:t>11. Comments &amp; Community</w:t>
-      </w:r>
-    </w:p>
-    <w:p>
-      <w:pPr>
-        <w:rPr>
-          <w:rFonts w:ascii="Segoe UI Emoji" w:hAnsi="Segoe UI Emoji" w:cs="Segoe UI Emoji"/>
-          <w:b/>
-          <w:bCs/>
-        </w:rPr>
-      </w:pPr>
-      <w:r>
-        <w:rPr>
-          <w:rFonts w:ascii="Segoe UI Emoji" w:hAnsi="Segoe UI Emoji" w:cs="Segoe UI Emoji"/>
-          <w:b/>
-          <w:bCs/>
-        </w:rPr>
-        <w:t>When responding:</w:t>
-      </w:r>
-    </w:p>
-    <w:p>
-      <w:pPr>
-        <w:numPr>
-          <w:ilvl w:val="0"/>
-          <w:numId w:val="24"/>
-        </w:numPr>
-        <w:rPr>
-          <w:rFonts w:ascii="Segoe UI Emoji" w:hAnsi="Segoe UI Emoji" w:cs="Segoe UI Emoji"/>
-          <w:b/>
-          <w:bCs/>
-        </w:rPr>
-      </w:pPr>
-      <w:r>
-        <w:rPr>
-          <w:rFonts w:ascii="Segoe UI Emoji" w:hAnsi="Segoe UI Emoji" w:cs="Segoe UI Emoji"/>
-          <w:b/>
-          <w:bCs/>
-        </w:rPr>
-        <w:t xml:space="preserve">Thank people for thoughtful contributions. </w:t>
-      </w:r>
-    </w:p>
-    <w:p>
-      <w:pPr>
-        <w:numPr>
-          <w:ilvl w:val="0"/>
-          <w:numId w:val="24"/>
-        </w:numPr>
-        <w:rPr>
-          <w:rFonts w:ascii="Segoe UI Emoji" w:hAnsi="Segoe UI Emoji" w:cs="Segoe UI Emoji"/>
-          <w:b/>
-          <w:bCs/>
-        </w:rPr>
-      </w:pPr>
-      <w:r>
-        <w:rPr>
-          <w:rFonts w:ascii="Segoe UI Emoji" w:hAnsi="Segoe UI Emoji" w:cs="Segoe UI Emoji"/>
-          <w:b/>
-          <w:bCs/>
-        </w:rPr>
-        <w:t xml:space="preserve">Ask follow-up questions. </w:t>
-      </w:r>
-    </w:p>
-    <w:p>
-      <w:pPr>
-        <w:numPr>
-          <w:ilvl w:val="0"/>
-          <w:numId w:val="24"/>
-        </w:numPr>
-        <w:rPr>
-          <w:rFonts w:ascii="Segoe UI Emoji" w:hAnsi="Segoe UI Emoji" w:cs="Segoe UI Emoji"/>
-          <w:b/>
-          <w:bCs/>
-        </w:rPr>
-      </w:pPr>
-      <w:r>
-        <w:rPr>
-          <w:rFonts w:ascii="Segoe UI Emoji" w:hAnsi="Segoe UI Emoji" w:cs="Segoe UI Emoji"/>
-          <w:b/>
-          <w:bCs/>
-        </w:rPr>
-        <w:t xml:space="preserve">Clarify misunderstandings politely. </w:t>
-      </w:r>
-    </w:p>
-    <w:p>
-      <w:pPr>
-        <w:numPr>
-          <w:ilvl w:val="0"/>
-          <w:numId w:val="24"/>
-        </w:numPr>
-        <w:rPr>
-          <w:rFonts w:ascii="Segoe UI Emoji" w:hAnsi="Segoe UI Emoji" w:cs="Segoe UI Emoji"/>
-          <w:b/>
-          <w:bCs/>
-        </w:rPr>
-      </w:pPr>
-      <w:r>
-        <w:rPr>
-          <w:rFonts w:ascii="Segoe UI Emoji" w:hAnsi="Segoe UI Emoji" w:cs="Segoe UI Emoji"/>
-          <w:b/>
-          <w:bCs/>
-        </w:rPr>
-        <w:t xml:space="preserve">Welcome constructive disagreement. </w:t>
-      </w:r>
-    </w:p>
-    <w:p>
-      <w:pPr>
-        <w:rPr>
-          <w:rFonts w:ascii="Segoe UI Emoji" w:hAnsi="Segoe UI Emoji" w:cs="Segoe UI Emoji"/>
-          <w:b/>
-          <w:bCs/>
-        </w:rPr>
-      </w:pPr>
-      <w:r>
-        <w:rPr>
-          <w:rFonts w:ascii="Segoe UI Emoji" w:hAnsi="Segoe UI Emoji" w:cs="Segoe UI Emoji"/>
-          <w:b/>
-          <w:bCs/>
-        </w:rPr>
-        <w:t>Do not:</w:t>
-      </w:r>
-    </w:p>
-    <w:p>
-      <w:pPr>
-        <w:numPr>
-          <w:ilvl w:val="0"/>
-          <w:numId w:val="25"/>
-        </w:numPr>
-        <w:rPr>
-          <w:rFonts w:ascii="Segoe UI Emoji" w:hAnsi="Segoe UI Emoji" w:cs="Segoe UI Emoji"/>
-          <w:b/>
-          <w:bCs/>
-        </w:rPr>
-      </w:pPr>
-      <w:r>
-        <w:rPr>
-          <w:rFonts w:ascii="Segoe UI Emoji" w:hAnsi="Segoe UI Emoji" w:cs="Segoe UI Emoji"/>
-          <w:b/>
-          <w:bCs/>
-        </w:rPr>
-        <w:t xml:space="preserve">Argue to "win". </w:t>
-      </w:r>
-    </w:p>
-    <w:p>
-      <w:pPr>
-        <w:numPr>
-          <w:ilvl w:val="0"/>
-          <w:numId w:val="25"/>
-        </w:numPr>
-        <w:rPr>
-          <w:rFonts w:ascii="Segoe UI Emoji" w:hAnsi="Segoe UI Emoji" w:cs="Segoe UI Emoji"/>
-          <w:b/>
-          <w:bCs/>
-        </w:rPr>
-      </w:pPr>
-      <w:r>
-        <w:rPr>
-          <w:rFonts w:ascii="Segoe UI Emoji" w:hAnsi="Segoe UI Emoji" w:cs="Segoe UI Emoji"/>
-          <w:b/>
-          <w:bCs/>
-        </w:rPr>
-        <w:t xml:space="preserve">Mock or dismiss others. </w:t>
-      </w:r>
-    </w:p>
-    <w:p>
-      <w:pPr>
-        <w:numPr>
-          <w:ilvl w:val="0"/>
-          <w:numId w:val="25"/>
-        </w:numPr>
-        <w:rPr>
-          <w:rFonts w:ascii="Segoe UI Emoji" w:hAnsi="Segoe UI Emoji" w:cs="Segoe UI Emoji"/>
-          <w:b/>
-          <w:bCs/>
-        </w:rPr>
-      </w:pPr>
-      <w:r>
-        <w:rPr>
-          <w:rFonts w:ascii="Segoe UI Emoji" w:hAnsi="Segoe UI Emoji" w:cs="Segoe UI Emoji"/>
-          <w:b/>
-          <w:bCs/>
-        </w:rPr>
-        <w:t xml:space="preserve">Engage with abusive comments. </w:t>
-      </w:r>
-    </w:p>
-    <w:p>
-      <w:pPr>
-        <w:rPr>
-          <w:rFonts w:ascii="Segoe UI Emoji" w:hAnsi="Segoe UI Emoji" w:cs="Segoe UI Emoji"/>
-          <w:b/>
-          <w:bCs/>
-        </w:rPr>
-      </w:pPr>
-      <w:r>
-        <w:rPr>
-          <w:rFonts w:ascii="Segoe UI Emoji" w:hAnsi="Segoe UI Emoji" w:cs="Segoe UI Emoji"/>
-          <w:b/>
-          <w:bCs/>
-        </w:rPr>
-        <w:pict w14:anchorId="5C013671">
-          <v:rect id="_x0000_i1162" style="width:0;height:1.5pt" o:hralign="center" o:hrstd="t" o:hr="t" fillcolor="#a0a0a0" stroked="f"/>
-        </w:pict>
-      </w:r>
-    </w:p>
-    <w:p>
-      <w:pPr>
-        <w:rPr>
-          <w:rFonts w:ascii="Segoe UI Emoji" w:hAnsi="Segoe UI Emoji" w:cs="Segoe UI Emoji"/>
-          <w:b/>
-          <w:bCs/>
-        </w:rPr>
-      </w:pPr>
-      <w:r>
-        <w:rPr>
-          <w:rFonts w:ascii="Segoe UI Emoji" w:hAnsi="Segoe UI Emoji" w:cs="Segoe UI Emoji"/>
-          <w:b/>
-          <w:bCs/>
-        </w:rPr>
-        <w:t>12. Publishing Frequency</w:t>
-      </w:r>
-    </w:p>
-    <w:p>
-      <w:pPr>
-        <w:rPr>
-          <w:rFonts w:ascii="Segoe UI Emoji" w:hAnsi="Segoe UI Emoji" w:cs="Segoe UI Emoji"/>
-          <w:b/>
-          <w:bCs/>
-        </w:rPr>
-      </w:pPr>
-      <w:r>
-        <w:rPr>
-          <w:rFonts w:ascii="Segoe UI Emoji" w:hAnsi="Segoe UI Emoji" w:cs="Segoe UI Emoji"/>
-          <w:b/>
-          <w:bCs/>
-        </w:rPr>
-        <w:t>Aim for 2–3 high-quality posts per week.</w:t>
-      </w:r>
-    </w:p>
-    <w:p>
-      <w:pPr>
-        <w:rPr>
-          <w:rFonts w:ascii="Segoe UI Emoji" w:hAnsi="Segoe UI Emoji" w:cs="Segoe UI Emoji"/>
-          <w:b/>
-          <w:bCs/>
-        </w:rPr>
-      </w:pPr>
-      <w:r>
-        <w:rPr>
-          <w:rFonts w:ascii="Segoe UI Emoji" w:hAnsi="Segoe UI Emoji" w:cs="Segoe UI Emoji"/>
-          <w:b/>
-          <w:bCs/>
-        </w:rPr>
-        <w:t>Quality always comes before quantity.</w:t>
-      </w:r>
-    </w:p>
-    <w:p>
-      <w:pPr>
-        <w:rPr>
-          <w:rFonts w:ascii="Segoe UI Emoji" w:hAnsi="Segoe UI Emoji" w:cs="Segoe UI Emoji"/>
-          <w:b/>
-          <w:bCs/>
-        </w:rPr>
-      </w:pPr>
-      <w:r>
-        <w:rPr>
-          <w:rFonts w:ascii="Segoe UI Emoji" w:hAnsi="Segoe UI Emoji" w:cs="Segoe UI Emoji"/>
-          <w:b/>
-          <w:bCs/>
-        </w:rPr>
-        <w:t>If there is nothing meaningful to share, do not force a post.</w:t>
-      </w:r>
-    </w:p>
-    <w:p>
-      <w:pPr>
-        <w:rPr>
-          <w:rFonts w:ascii="Segoe UI Emoji" w:hAnsi="Segoe UI Emoji" w:cs="Segoe UI Emoji"/>
-          <w:b/>
-          <w:bCs/>
-        </w:rPr>
-      </w:pPr>
-      <w:r>
-        <w:rPr>
-          <w:rFonts w:ascii="Segoe UI Emoji" w:hAnsi="Segoe UI Emoji" w:cs="Segoe UI Emoji"/>
-          <w:b/>
-          <w:bCs/>
-        </w:rPr>
-        <w:pict w14:anchorId="35926910">
-          <v:rect id="_x0000_i1163" style="width:0;height:1.5pt" o:hralign="center" o:hrstd="t" o:hr="t" fillcolor="#a0a0a0" stroked="f"/>
-        </w:pict>
-      </w:r>
-    </w:p>
-    <w:p>
-      <w:pPr>
-        <w:rPr>
-          <w:rFonts w:ascii="Segoe UI Emoji" w:hAnsi="Segoe UI Emoji" w:cs="Segoe UI Emoji"/>
-          <w:b/>
-          <w:bCs/>
-        </w:rPr>
-      </w:pPr>
-      <w:r>
-        <w:rPr>
-          <w:rFonts w:ascii="Segoe UI Emoji" w:hAnsi="Segoe UI Emoji" w:cs="Segoe UI Emoji"/>
-          <w:b/>
-          <w:bCs/>
-        </w:rPr>
-        <w:t>13. Content Review Workflow</w:t>
-      </w:r>
-    </w:p>
-    <w:p>
-      <w:pPr>
-        <w:rPr>
-          <w:rFonts w:ascii="Segoe UI Emoji" w:hAnsi="Segoe UI Emoji" w:cs="Segoe UI Emoji"/>
-          <w:b/>
-          <w:bCs/>
-        </w:rPr>
-      </w:pPr>
-      <w:r>
-        <w:rPr>
-          <w:rFonts w:ascii="Segoe UI Emoji" w:hAnsi="Segoe UI Emoji" w:cs="Segoe UI Emoji"/>
-          <w:b/>
-          <w:bCs/>
-        </w:rPr>
-        <w:t>Every post follows this process:</w:t>
-      </w:r>
-    </w:p>
-    <w:p>
-      <w:pPr>
-        <w:rPr>
-          <w:rFonts w:ascii="Segoe UI Emoji" w:hAnsi="Segoe UI Emoji" w:cs="Segoe UI Emoji"/>
-          <w:b/>
-          <w:bCs/>
-        </w:rPr>
-      </w:pPr>
-      <w:r>
-        <w:rPr>
-          <w:rFonts w:ascii="Segoe UI Emoji" w:hAnsi="Segoe UI Emoji" w:cs="Segoe UI Emoji"/>
-          <w:b/>
-          <w:bCs/>
-        </w:rPr>
-        <w:t>Observation</w:t>
-      </w:r>
-    </w:p>
-    <w:p>
-      <w:pPr>
-        <w:rPr>
-          <w:rFonts w:ascii="Segoe UI Emoji" w:hAnsi="Segoe UI Emoji" w:cs="Segoe UI Emoji"/>
-          <w:b/>
-          <w:bCs/>
-        </w:rPr>
-      </w:pPr>
-      <w:r>
-        <w:rPr>
-          <w:rFonts w:ascii="Segoe UI Emoji" w:hAnsi="Segoe UI Emoji" w:cs="Segoe UI Emoji"/>
-          <w:b/>
-          <w:bCs/>
-        </w:rPr>
-        <w:t xml:space="preserve">      ↓</w:t>
-      </w:r>
-    </w:p>
-    <w:p>
-      <w:pPr>
-        <w:rPr>
-          <w:rFonts w:ascii="Segoe UI Emoji" w:hAnsi="Segoe UI Emoji" w:cs="Segoe UI Emoji"/>
-          <w:b/>
-          <w:bCs/>
-        </w:rPr>
-      </w:pPr>
-      <w:r>
-        <w:rPr>
-          <w:rFonts w:ascii="Segoe UI Emoji" w:hAnsi="Segoe UI Emoji" w:cs="Segoe UI Emoji"/>
-          <w:b/>
-          <w:bCs/>
-        </w:rPr>
-        <w:t>Research &amp; Validation</w:t>
-      </w:r>
-    </w:p>
-    <w:p>
-      <w:pPr>
-        <w:rPr>
-          <w:rFonts w:ascii="Segoe UI Emoji" w:hAnsi="Segoe UI Emoji" w:cs="Segoe UI Emoji"/>
-          <w:b/>
-          <w:bCs/>
-        </w:rPr>
-      </w:pPr>
-      <w:r>
-        <w:rPr>
-          <w:rFonts w:ascii="Segoe UI Emoji" w:hAnsi="Segoe UI Emoji" w:cs="Segoe UI Emoji"/>
-          <w:b/>
-          <w:bCs/>
-        </w:rPr>
-        <w:t xml:space="preserve">      ↓</w:t>
-      </w:r>
-    </w:p>
-    <w:p>
-      <w:pPr>
-        <w:rPr>
-          <w:rFonts w:ascii="Segoe UI Emoji" w:hAnsi="Segoe UI Emoji" w:cs="Segoe UI Emoji"/>
-          <w:b/>
-          <w:bCs/>
-        </w:rPr>
-      </w:pPr>
-      <w:r>
-        <w:rPr>
-          <w:rFonts w:ascii="Segoe UI Emoji" w:hAnsi="Segoe UI Emoji" w:cs="Segoe UI Emoji"/>
-          <w:b/>
-          <w:bCs/>
-        </w:rPr>
-        <w:t>Draft</w:t>
-      </w:r>
-    </w:p>
-    <w:p>
-      <w:pPr>
-        <w:rPr>
-          <w:rFonts w:ascii="Segoe UI Emoji" w:hAnsi="Segoe UI Emoji" w:cs="Segoe UI Emoji"/>
-          <w:b/>
-          <w:bCs/>
-        </w:rPr>
-      </w:pPr>
-      <w:r>
-        <w:rPr>
-          <w:rFonts w:ascii="Segoe UI Emoji" w:hAnsi="Segoe UI Emoji" w:cs="Segoe UI Emoji"/>
-          <w:b/>
-          <w:bCs/>
-        </w:rPr>
-        <w:t xml:space="preserve">      ↓</w:t>
-      </w:r>
-    </w:p>
-    <w:p>
-      <w:pPr>
-        <w:rPr>
-          <w:rFonts w:ascii="Segoe UI Emoji" w:hAnsi="Segoe UI Emoji" w:cs="Segoe UI Emoji"/>
-          <w:b/>
-          <w:bCs/>
-        </w:rPr>
-      </w:pPr>
-      <w:r>
-        <w:rPr>
-          <w:rFonts w:ascii="Segoe UI Emoji" w:hAnsi="Segoe UI Emoji" w:cs="Segoe UI Emoji"/>
-          <w:b/>
-          <w:bCs/>
-        </w:rPr>
-        <w:t>Brand Review</w:t>
-      </w:r>
-    </w:p>
-    <w:p>
-      <w:pPr>
-        <w:rPr>
-          <w:rFonts w:ascii="Segoe UI Emoji" w:hAnsi="Segoe UI Emoji" w:cs="Segoe UI Emoji"/>
-          <w:b/>
-          <w:bCs/>
-        </w:rPr>
-      </w:pPr>
-      <w:r>
-        <w:rPr>
-          <w:rFonts w:ascii="Segoe UI Emoji" w:hAnsi="Segoe UI Emoji" w:cs="Segoe UI Emoji"/>
-          <w:b/>
-          <w:bCs/>
-        </w:rPr>
-        <w:t xml:space="preserve">      ↓</w:t>
-      </w:r>
-    </w:p>
-    <w:p>
-      <w:pPr>
-        <w:rPr>
-          <w:rFonts w:ascii="Segoe UI Emoji" w:hAnsi="Segoe UI Emoji" w:cs="Segoe UI Emoji"/>
-          <w:b/>
-          <w:bCs/>
-        </w:rPr>
-      </w:pPr>
-      <w:r>
-        <w:rPr>
-          <w:rFonts w:ascii="Segoe UI Emoji" w:hAnsi="Segoe UI Emoji" w:cs="Segoe UI Emoji"/>
-          <w:b/>
-          <w:bCs/>
-        </w:rPr>
-        <w:t>Visual Design</w:t>
-      </w:r>
-    </w:p>
-    <w:p>
-      <w:pPr>
-        <w:rPr>
-          <w:rFonts w:ascii="Segoe UI Emoji" w:hAnsi="Segoe UI Emoji" w:cs="Segoe UI Emoji"/>
-          <w:b/>
-          <w:bCs/>
-        </w:rPr>
-      </w:pPr>
-      <w:r>
-        <w:rPr>
-          <w:rFonts w:ascii="Segoe UI Emoji" w:hAnsi="Segoe UI Emoji" w:cs="Segoe UI Emoji"/>
-          <w:b/>
-          <w:bCs/>
-        </w:rPr>
-        <w:t xml:space="preserve">      ↓</w:t>
-      </w:r>
-    </w:p>
-    <w:p>
-      <w:pPr>
-        <w:rPr>
-          <w:rFonts w:ascii="Segoe UI Emoji" w:hAnsi="Segoe UI Emoji" w:cs="Segoe UI Emoji"/>
-          <w:b/>
-          <w:bCs/>
-        </w:rPr>
-      </w:pPr>
-      <w:r>
-        <w:rPr>
-          <w:rFonts w:ascii="Segoe UI Emoji" w:hAnsi="Segoe UI Emoji" w:cs="Segoe UI Emoji"/>
-          <w:b/>
-          <w:bCs/>
-        </w:rPr>
-        <w:t>Final Proofreading</w:t>
-      </w:r>
-    </w:p>
-    <w:p>
-      <w:pPr>
-        <w:rPr>
-          <w:rFonts w:ascii="Segoe UI Emoji" w:hAnsi="Segoe UI Emoji" w:cs="Segoe UI Emoji"/>
-          <w:b/>
-          <w:bCs/>
-        </w:rPr>
-      </w:pPr>
-      <w:r>
-        <w:rPr>
-          <w:rFonts w:ascii="Segoe UI Emoji" w:hAnsi="Segoe UI Emoji" w:cs="Segoe UI Emoji"/>
-          <w:b/>
-          <w:bCs/>
-        </w:rPr>
-        <w:t xml:space="preserve">      ↓</w:t>
-      </w:r>
-    </w:p>
-    <w:p>
-      <w:pPr>
-        <w:rPr>
-          <w:rFonts w:ascii="Segoe UI Emoji" w:hAnsi="Segoe UI Emoji" w:cs="Segoe UI Emoji"/>
-          <w:b/>
-          <w:bCs/>
-        </w:rPr>
-      </w:pPr>
-      <w:r>
-        <w:rPr>
-          <w:rFonts w:ascii="Segoe UI Emoji" w:hAnsi="Segoe UI Emoji" w:cs="Segoe UI Emoji"/>
-          <w:b/>
-          <w:bCs/>
-        </w:rPr>
-        <w:t>Publish</w:t>
-      </w:r>
-    </w:p>
-    <w:p>
-      <w:pPr>
-        <w:rPr>
-          <w:rFonts w:ascii="Segoe UI Emoji" w:hAnsi="Segoe UI Emoji" w:cs="Segoe UI Emoji"/>
-          <w:b/>
-          <w:bCs/>
-        </w:rPr>
-      </w:pPr>
-      <w:r>
-        <w:rPr>
-          <w:rFonts w:ascii="Segoe UI Emoji" w:hAnsi="Segoe UI Emoji" w:cs="Segoe UI Emoji"/>
-          <w:b/>
-          <w:bCs/>
-        </w:rPr>
-        <w:t xml:space="preserve">      ↓</w:t>
-      </w:r>
-    </w:p>
-    <w:p>
-      <w:pPr>
-        <w:rPr>
-          <w:rFonts w:ascii="Segoe UI Emoji" w:hAnsi="Segoe UI Emoji" w:cs="Segoe UI Emoji"/>
-          <w:b/>
-          <w:bCs/>
-        </w:rPr>
-      </w:pPr>
-      <w:r>
-        <w:rPr>
-          <w:rFonts w:ascii="Segoe UI Emoji" w:hAnsi="Segoe UI Emoji" w:cs="Segoe UI Emoji"/>
-          <w:b/>
-          <w:bCs/>
-        </w:rPr>
-        <w:t>Community Discussion</w:t>
-      </w:r>
-    </w:p>
-    <w:p>
-      <w:pPr>
-        <w:rPr>
-          <w:rFonts w:ascii="Segoe UI Emoji" w:hAnsi="Segoe UI Emoji" w:cs="Segoe UI Emoji"/>
-          <w:b/>
-          <w:bCs/>
-        </w:rPr>
-      </w:pPr>
-      <w:r>
-        <w:rPr>
-          <w:rFonts w:ascii="Segoe UI Emoji" w:hAnsi="Segoe UI Emoji" w:cs="Segoe UI Emoji"/>
-          <w:b/>
-          <w:bCs/>
-        </w:rPr>
-        <w:t xml:space="preserve">      ↓</w:t>
-      </w:r>
-    </w:p>
-    <w:p>
-      <w:pPr>
-        <w:rPr>
-          <w:rFonts w:ascii="Segoe UI Emoji" w:hAnsi="Segoe UI Emoji" w:cs="Segoe UI Emoji"/>
-          <w:b/>
-          <w:bCs/>
-        </w:rPr>
-      </w:pPr>
-      <w:r>
-        <w:rPr>
-          <w:rFonts w:ascii="Segoe UI Emoji" w:hAnsi="Segoe UI Emoji" w:cs="Segoe UI Emoji"/>
-          <w:b/>
-          <w:bCs/>
-        </w:rPr>
-        <w:t>Archive</w:t>
-      </w:r>
-    </w:p>
-    <w:p>
-      <w:pPr>
-        <w:rPr>
-          <w:rFonts w:ascii="Segoe UI Emoji" w:hAnsi="Segoe UI Emoji" w:cs="Segoe UI Emoji"/>
-          <w:b/>
-          <w:bCs/>
-        </w:rPr>
-      </w:pPr>
-      <w:r>
-        <w:rPr>
-          <w:rFonts w:ascii="Segoe UI Emoji" w:hAnsi="Segoe UI Emoji" w:cs="Segoe UI Emoji"/>
-          <w:b/>
-          <w:bCs/>
-        </w:rPr>
-        <w:pict w14:anchorId="4CD566C0">
-          <v:rect id="_x0000_i1164" style="width:0;height:1.5pt" o:hralign="center" o:hrstd="t" o:hr="t" fillcolor="#a0a0a0" stroked="f"/>
-        </w:pict>
-      </w:r>
-    </w:p>
-    <w:p>
-      <w:pPr>
-        <w:rPr>
-          <w:rFonts w:ascii="Segoe UI Emoji" w:hAnsi="Segoe UI Emoji" w:cs="Segoe UI Emoji"/>
-          <w:b/>
-          <w:bCs/>
-        </w:rPr>
-      </w:pPr>
-      <w:r>
-        <w:rPr>
-          <w:rFonts w:ascii="Segoe UI Emoji" w:hAnsi="Segoe UI Emoji" w:cs="Segoe UI Emoji"/>
-          <w:b/>
-          <w:bCs/>
-        </w:rPr>
-        <w:t>14. Hashtag Policy</w:t>
-      </w:r>
-    </w:p>
-    <w:p>
-      <w:pPr>
-        <w:rPr>
-          <w:rFonts w:ascii="Segoe UI Emoji" w:hAnsi="Segoe UI Emoji" w:cs="Segoe UI Emoji"/>
-          <w:b/>
-          <w:bCs/>
-        </w:rPr>
-      </w:pPr>
-      <w:r>
-        <w:rPr>
-          <w:rFonts w:ascii="Segoe UI Emoji" w:hAnsi="Segoe UI Emoji" w:cs="Segoe UI Emoji"/>
-          <w:b/>
-          <w:bCs/>
-        </w:rPr>
-        <w:t>Use only a few relevant hashtags.</w:t>
-      </w:r>
-    </w:p>
-    <w:p>
-      <w:pPr>
-        <w:rPr>
-          <w:rFonts w:ascii="Segoe UI Emoji" w:hAnsi="Segoe UI Emoji" w:cs="Segoe UI Emoji"/>
-          <w:b/>
-          <w:bCs/>
-        </w:rPr>
-      </w:pPr>
-      <w:r>
-        <w:rPr>
-          <w:rFonts w:ascii="Segoe UI Emoji" w:hAnsi="Segoe UI Emoji" w:cs="Segoe UI Emoji"/>
-          <w:b/>
-          <w:bCs/>
-        </w:rPr>
-        <w:t>Examples:</w:t>
-      </w:r>
-    </w:p>
-    <w:p>
-      <w:pPr>
-        <w:numPr>
-          <w:ilvl w:val="0"/>
-          <w:numId w:val="26"/>
-        </w:numPr>
-        <w:rPr>
-          <w:rFonts w:ascii="Segoe UI Emoji" w:hAnsi="Segoe UI Emoji" w:cs="Segoe UI Emoji"/>
-          <w:b/>
-          <w:bCs/>
-        </w:rPr>
-      </w:pPr>
-      <w:r>
-        <w:rPr>
-          <w:rFonts w:ascii="Segoe UI Emoji" w:hAnsi="Segoe UI Emoji" w:cs="Segoe UI Emoji"/>
-          <w:b/>
-          <w:bCs/>
-        </w:rPr>
-        <w:t xml:space="preserve">#HumanCenteredDesign </w:t>
-      </w:r>
-    </w:p>
-    <w:p>
-      <w:pPr>
-        <w:numPr>
-          <w:ilvl w:val="0"/>
-          <w:numId w:val="26"/>
-        </w:numPr>
-        <w:rPr>
-          <w:rFonts w:ascii="Segoe UI Emoji" w:hAnsi="Segoe UI Emoji" w:cs="Segoe UI Emoji"/>
-          <w:b/>
-          <w:bCs/>
-        </w:rPr>
-      </w:pPr>
-      <w:r>
-        <w:rPr>
-          <w:rFonts w:ascii="Segoe UI Emoji" w:hAnsi="Segoe UI Emoji" w:cs="Segoe UI Emoji"/>
-          <w:b/>
-          <w:bCs/>
-        </w:rPr>
-        <w:t xml:space="preserve">#UXResearch </w:t>
-      </w:r>
-    </w:p>
-    <w:p>
-      <w:pPr>
-        <w:numPr>
-          <w:ilvl w:val="0"/>
-          <w:numId w:val="26"/>
-        </w:numPr>
-        <w:rPr>
-          <w:rFonts w:ascii="Segoe UI Emoji" w:hAnsi="Segoe UI Emoji" w:cs="Segoe UI Emoji"/>
-          <w:b/>
-          <w:bCs/>
-        </w:rPr>
-      </w:pPr>
-      <w:r>
-        <w:rPr>
-          <w:rFonts w:ascii="Segoe UI Emoji" w:hAnsi="Segoe UI Emoji" w:cs="Segoe UI Emoji"/>
-          <w:b/>
-          <w:bCs/>
-        </w:rPr>
-        <w:t xml:space="preserve">#Accessibility </w:t>
-      </w:r>
-    </w:p>
-    <w:p>
-      <w:pPr>
-        <w:numPr>
-          <w:ilvl w:val="0"/>
-          <w:numId w:val="26"/>
-        </w:numPr>
-        <w:rPr>
-          <w:rFonts w:ascii="Segoe UI Emoji" w:hAnsi="Segoe UI Emoji" w:cs="Segoe UI Emoji"/>
-          <w:b/>
-          <w:bCs/>
-        </w:rPr>
-      </w:pPr>
-      <w:r>
-        <w:rPr>
-          <w:rFonts w:ascii="Segoe UI Emoji" w:hAnsi="Segoe UI Emoji" w:cs="Segoe UI Emoji"/>
-          <w:b/>
-          <w:bCs/>
-        </w:rPr>
-        <w:t xml:space="preserve">#SystemsThinking </w:t>
-      </w:r>
-    </w:p>
-    <w:p>
-      <w:pPr>
-        <w:numPr>
-          <w:ilvl w:val="0"/>
-          <w:numId w:val="26"/>
-        </w:numPr>
-        <w:rPr>
-          <w:rFonts w:ascii="Segoe UI Emoji" w:hAnsi="Segoe UI Emoji" w:cs="Segoe UI Emoji"/>
-          <w:b/>
-          <w:bCs/>
-        </w:rPr>
-      </w:pPr>
-      <w:r>
-        <w:rPr>
-          <w:rFonts w:ascii="Segoe UI Emoji" w:hAnsi="Segoe UI Emoji" w:cs="Segoe UI Emoji"/>
-          <w:b/>
-          <w:bCs/>
-        </w:rPr>
-        <w:t xml:space="preserve">#Research </w:t>
-      </w:r>
-    </w:p>
-    <w:p>
-      <w:pPr>
-        <w:numPr>
-          <w:ilvl w:val="0"/>
-          <w:numId w:val="26"/>
-        </w:numPr>
-        <w:rPr>
-          <w:rFonts w:ascii="Segoe UI Emoji" w:hAnsi="Segoe UI Emoji" w:cs="Segoe UI Emoji"/>
-          <w:b/>
-          <w:bCs/>
-        </w:rPr>
-      </w:pPr>
-      <w:r>
-        <w:rPr>
-          <w:rFonts w:ascii="Segoe UI Emoji" w:hAnsi="Segoe UI Emoji" w:cs="Segoe UI Emoji"/>
-          <w:b/>
-          <w:bCs/>
-        </w:rPr>
-        <w:t xml:space="preserve">#Innovation </w:t>
-      </w:r>
-    </w:p>
-    <w:p>
-      <w:pPr>
-        <w:rPr>
-          <w:rFonts w:ascii="Segoe UI Emoji" w:hAnsi="Segoe UI Emoji" w:cs="Segoe UI Emoji"/>
-          <w:b/>
-          <w:bCs/>
-        </w:rPr>
-      </w:pPr>
-      <w:r>
-        <w:rPr>
-          <w:rFonts w:ascii="Segoe UI Emoji" w:hAnsi="Segoe UI Emoji" w:cs="Segoe UI Emoji"/>
-          <w:b/>
-          <w:bCs/>
-        </w:rPr>
-        <w:t>Avoid long lists of unrelated hashtags.</w:t>
-      </w:r>
-    </w:p>
-    <w:p>
-      <w:pPr>
-        <w:rPr>
-          <w:rFonts w:ascii="Segoe UI Emoji" w:hAnsi="Segoe UI Emoji" w:cs="Segoe UI Emoji"/>
-          <w:b/>
-          <w:bCs/>
-        </w:rPr>
-      </w:pPr>
-      <w:r>
-        <w:rPr>
-          <w:rFonts w:ascii="Segoe UI Emoji" w:hAnsi="Segoe UI Emoji" w:cs="Segoe UI Emoji"/>
-          <w:b/>
-          <w:bCs/>
-        </w:rPr>
-        <w:pict w14:anchorId="31D3A8B8">
-          <v:rect id="_x0000_i1165" style="width:0;height:1.5pt" o:hralign="center" o:hrstd="t" o:hr="t" fillcolor="#a0a0a0" stroked="f"/>
-        </w:pict>
-      </w:r>
-    </w:p>
-    <w:p>
-      <w:pPr>
-        <w:rPr>
-          <w:rFonts w:ascii="Segoe UI Emoji" w:hAnsi="Segoe UI Emoji" w:cs="Segoe UI Emoji"/>
-          <w:b/>
-          <w:bCs/>
-        </w:rPr>
-      </w:pPr>
-      <w:r>
-        <w:rPr>
-          <w:rFonts w:ascii="Segoe UI Emoji" w:hAnsi="Segoe UI Emoji" w:cs="Segoe UI Emoji"/>
-          <w:b/>
-          <w:bCs/>
-        </w:rPr>
-        <w:t>15. What We Never Publish</w:t>
-      </w:r>
-    </w:p>
-    <w:p>
-      <w:pPr>
-        <w:rPr>
-          <w:rFonts w:ascii="Segoe UI Emoji" w:hAnsi="Segoe UI Emoji" w:cs="Segoe UI Emoji"/>
-          <w:b/>
-          <w:bCs/>
-        </w:rPr>
-      </w:pPr>
-      <w:r>
-        <w:rPr>
-          <w:rFonts w:ascii="Segoe UI Emoji" w:hAnsi="Segoe UI Emoji" w:cs="Segoe UI Emoji"/>
-          <w:b/>
-          <w:bCs/>
-        </w:rPr>
-        <w:t>Never publish:</w:t>
-      </w:r>
-    </w:p>
-    <w:p>
-      <w:pPr>
-        <w:numPr>
-          <w:ilvl w:val="0"/>
-          <w:numId w:val="27"/>
-        </w:numPr>
-        <w:rPr>
-          <w:rFonts w:ascii="Segoe UI Emoji" w:hAnsi="Segoe UI Emoji" w:cs="Segoe UI Emoji"/>
-          <w:b/>
-          <w:bCs/>
-        </w:rPr>
-      </w:pPr>
-      <w:r>
-        <w:rPr>
-          <w:rFonts w:ascii="Segoe UI Emoji" w:hAnsi="Segoe UI Emoji" w:cs="Segoe UI Emoji"/>
-          <w:b/>
-          <w:bCs/>
-        </w:rPr>
-        <w:t xml:space="preserve">Unverified claims </w:t>
-      </w:r>
-    </w:p>
-    <w:p>
-      <w:pPr>
-        <w:numPr>
-          <w:ilvl w:val="0"/>
-          <w:numId w:val="27"/>
-        </w:numPr>
-        <w:rPr>
-          <w:rFonts w:ascii="Segoe UI Emoji" w:hAnsi="Segoe UI Emoji" w:cs="Segoe UI Emoji"/>
-          <w:b/>
-          <w:bCs/>
-        </w:rPr>
-      </w:pPr>
-      <w:r>
-        <w:rPr>
-          <w:rFonts w:ascii="Segoe UI Emoji" w:hAnsi="Segoe UI Emoji" w:cs="Segoe UI Emoji"/>
-          <w:b/>
-          <w:bCs/>
-        </w:rPr>
-        <w:t xml:space="preserve">Confidential information </w:t>
-      </w:r>
-    </w:p>
-    <w:p>
-      <w:pPr>
-        <w:numPr>
-          <w:ilvl w:val="0"/>
-          <w:numId w:val="27"/>
-        </w:numPr>
-        <w:rPr>
-          <w:rFonts w:ascii="Segoe UI Emoji" w:hAnsi="Segoe UI Emoji" w:cs="Segoe UI Emoji"/>
-          <w:b/>
-          <w:bCs/>
-        </w:rPr>
-      </w:pPr>
-      <w:r>
-        <w:rPr>
-          <w:rFonts w:ascii="Segoe UI Emoji" w:hAnsi="Segoe UI Emoji" w:cs="Segoe UI Emoji"/>
-          <w:b/>
-          <w:bCs/>
-        </w:rPr>
-        <w:t xml:space="preserve">Personal attacks </w:t>
-      </w:r>
-    </w:p>
-    <w:p>
-      <w:pPr>
-        <w:numPr>
-          <w:ilvl w:val="0"/>
-          <w:numId w:val="27"/>
-        </w:numPr>
-        <w:rPr>
-          <w:rFonts w:ascii="Segoe UI Emoji" w:hAnsi="Segoe UI Emoji" w:cs="Segoe UI Emoji"/>
-          <w:b/>
-          <w:bCs/>
-        </w:rPr>
-      </w:pPr>
-      <w:r>
-        <w:rPr>
-          <w:rFonts w:ascii="Segoe UI Emoji" w:hAnsi="Segoe UI Emoji" w:cs="Segoe UI Emoji"/>
-          <w:b/>
-          <w:bCs/>
-        </w:rPr>
-        <w:t xml:space="preserve">Political campaigning </w:t>
-      </w:r>
-    </w:p>
-    <w:p>
-      <w:pPr>
-        <w:numPr>
-          <w:ilvl w:val="0"/>
-          <w:numId w:val="27"/>
-        </w:numPr>
-        <w:rPr>
-          <w:rFonts w:ascii="Segoe UI Emoji" w:hAnsi="Segoe UI Emoji" w:cs="Segoe UI Emoji"/>
-          <w:b/>
-          <w:bCs/>
-        </w:rPr>
-      </w:pPr>
-      <w:r>
-        <w:rPr>
-          <w:rFonts w:ascii="Segoe UI Emoji" w:hAnsi="Segoe UI Emoji" w:cs="Segoe UI Emoji"/>
-          <w:b/>
-          <w:bCs/>
-        </w:rPr>
-        <w:t xml:space="preserve">Religious campaigning </w:t>
-      </w:r>
-    </w:p>
-    <w:p>
-      <w:pPr>
-        <w:numPr>
-          <w:ilvl w:val="0"/>
-          <w:numId w:val="27"/>
-        </w:numPr>
-        <w:rPr>
-          <w:rFonts w:ascii="Segoe UI Emoji" w:hAnsi="Segoe UI Emoji" w:cs="Segoe UI Emoji"/>
-          <w:b/>
-          <w:bCs/>
-        </w:rPr>
-      </w:pPr>
-      <w:r>
-        <w:rPr>
-          <w:rFonts w:ascii="Segoe UI Emoji" w:hAnsi="Segoe UI Emoji" w:cs="Segoe UI Emoji"/>
-          <w:b/>
-          <w:bCs/>
-        </w:rPr>
-        <w:t xml:space="preserve">Misleading statistics </w:t>
-      </w:r>
-    </w:p>
-    <w:p>
-      <w:pPr>
-        <w:numPr>
-          <w:ilvl w:val="0"/>
-          <w:numId w:val="27"/>
-        </w:numPr>
-        <w:rPr>
-          <w:rFonts w:ascii="Segoe UI Emoji" w:hAnsi="Segoe UI Emoji" w:cs="Segoe UI Emoji"/>
-          <w:b/>
-          <w:bCs/>
-        </w:rPr>
-      </w:pPr>
-      <w:r>
-        <w:rPr>
-          <w:rFonts w:ascii="Segoe UI Emoji" w:hAnsi="Segoe UI Emoji" w:cs="Segoe UI Emoji"/>
-          <w:b/>
-          <w:bCs/>
-        </w:rPr>
-        <w:t xml:space="preserve">Fear-based content </w:t>
-      </w:r>
-    </w:p>
-    <w:p>
-      <w:pPr>
-        <w:numPr>
-          <w:ilvl w:val="0"/>
-          <w:numId w:val="27"/>
-        </w:numPr>
-        <w:rPr>
-          <w:rFonts w:ascii="Segoe UI Emoji" w:hAnsi="Segoe UI Emoji" w:cs="Segoe UI Emoji"/>
-          <w:b/>
-          <w:bCs/>
-        </w:rPr>
-      </w:pPr>
-      <w:r>
-        <w:rPr>
-          <w:rFonts w:ascii="Segoe UI Emoji" w:hAnsi="Segoe UI Emoji" w:cs="Segoe UI Emoji"/>
-          <w:b/>
-          <w:bCs/>
-        </w:rPr>
-        <w:t xml:space="preserve">AI-generated facts presented as research </w:t>
-      </w:r>
-    </w:p>
-    <w:p>
-      <w:pPr>
-        <w:numPr>
-          <w:ilvl w:val="0"/>
-          <w:numId w:val="27"/>
-        </w:numPr>
-        <w:rPr>
-          <w:rFonts w:ascii="Segoe UI Emoji" w:hAnsi="Segoe UI Emoji" w:cs="Segoe UI Emoji"/>
-          <w:b/>
-          <w:bCs/>
-        </w:rPr>
-      </w:pPr>
-      <w:r>
-        <w:rPr>
-          <w:rFonts w:ascii="Segoe UI Emoji" w:hAnsi="Segoe UI Emoji" w:cs="Segoe UI Emoji"/>
-          <w:b/>
-          <w:bCs/>
-        </w:rPr>
-        <w:t xml:space="preserve">Posts written only to attract attention </w:t>
-      </w:r>
-    </w:p>
-    <w:p>
-      <w:pPr>
-        <w:rPr>
-          <w:rFonts w:ascii="Segoe UI Emoji" w:hAnsi="Segoe UI Emoji" w:cs="Segoe UI Emoji"/>
-          <w:b/>
-          <w:bCs/>
-        </w:rPr>
-      </w:pPr>
-      <w:r>
-        <w:rPr>
-          <w:rFonts w:ascii="Segoe UI Emoji" w:hAnsi="Segoe UI Emoji" w:cs="Segoe UI Emoji"/>
-          <w:b/>
-          <w:bCs/>
-        </w:rPr>
-        <w:pict w14:anchorId="1FFC73F0">
-          <v:rect id="_x0000_i1166" style="width:0;height:1.5pt" o:hralign="center" o:hrstd="t" o:hr="t" fillcolor="#a0a0a0" stroked="f"/>
-        </w:pict>
-      </w:r>
-    </w:p>
-    <w:p>
-      <w:pPr>
-        <w:rPr>
-          <w:rFonts w:ascii="Segoe UI Emoji" w:hAnsi="Segoe UI Emoji" w:cs="Segoe UI Emoji"/>
-          <w:b/>
-          <w:bCs/>
-        </w:rPr>
-      </w:pPr>
-      <w:r>
-        <w:rPr>
-          <w:rFonts w:ascii="Segoe UI Emoji" w:hAnsi="Segoe UI Emoji" w:cs="Segoe UI Emoji"/>
-          <w:b/>
-          <w:bCs/>
-        </w:rPr>
-        <w:t>16. Long-Term Publishing Goals</w:t>
-      </w:r>
-    </w:p>
-    <w:p>
-      <w:pPr>
-        <w:rPr>
-          <w:rFonts w:ascii="Segoe UI Emoji" w:hAnsi="Segoe UI Emoji" w:cs="Segoe UI Emoji"/>
-          <w:b/>
-          <w:bCs/>
-        </w:rPr>
-      </w:pPr>
-      <w:r>
-        <w:rPr>
-          <w:rFonts w:ascii="Segoe UI Emoji" w:hAnsi="Segoe UI Emoji" w:cs="Segoe UI Emoji"/>
-          <w:b/>
-          <w:bCs/>
-        </w:rPr>
-        <w:t>Year 1</w:t>
-      </w:r>
-    </w:p>
-    <w:p>
-      <w:pPr>
-        <w:rPr>
-          <w:rFonts w:ascii="Segoe UI Emoji" w:hAnsi="Segoe UI Emoji" w:cs="Segoe UI Emoji"/>
-          <w:b/>
-          <w:bCs/>
-        </w:rPr>
-      </w:pPr>
-      <w:r>
-        <w:rPr>
-          <w:rFonts w:ascii="Segoe UI Emoji" w:hAnsi="Segoe UI Emoji" w:cs="Segoe UI Emoji"/>
-          <w:b/>
-          <w:bCs/>
-        </w:rPr>
-        <w:t>Build trust through consistent observations.</w:t>
-      </w:r>
-    </w:p>
-    <w:p>
-      <w:pPr>
-        <w:rPr>
-          <w:rFonts w:ascii="Segoe UI Emoji" w:hAnsi="Segoe UI Emoji" w:cs="Segoe UI Emoji"/>
-          <w:b/>
-          <w:bCs/>
-        </w:rPr>
-      </w:pPr>
-      <w:r>
-        <w:rPr>
-          <w:rFonts w:ascii="Segoe UI Emoji" w:hAnsi="Segoe UI Emoji" w:cs="Segoe UI Emoji"/>
-          <w:b/>
-          <w:bCs/>
-        </w:rPr>
-        <w:t>Year 2</w:t>
-      </w:r>
-    </w:p>
-    <w:p>
-      <w:pPr>
-        <w:rPr>
-          <w:rFonts w:ascii="Segoe UI Emoji" w:hAnsi="Segoe UI Emoji" w:cs="Segoe UI Emoji"/>
-          <w:b/>
-          <w:bCs/>
-        </w:rPr>
-      </w:pPr>
-      <w:r>
-        <w:rPr>
-          <w:rFonts w:ascii="Segoe UI Emoji" w:hAnsi="Segoe UI Emoji" w:cs="Segoe UI Emoji"/>
-          <w:b/>
-          <w:bCs/>
-        </w:rPr>
-        <w:t>Become recognised for thoughtful research.</w:t>
-      </w:r>
-    </w:p>
-    <w:p>
-      <w:pPr>
-        <w:rPr>
-          <w:rFonts w:ascii="Segoe UI Emoji" w:hAnsi="Segoe UI Emoji" w:cs="Segoe UI Emoji"/>
-          <w:b/>
-          <w:bCs/>
-        </w:rPr>
-      </w:pPr>
-      <w:r>
-        <w:rPr>
-          <w:rFonts w:ascii="Segoe UI Emoji" w:hAnsi="Segoe UI Emoji" w:cs="Segoe UI Emoji"/>
-          <w:b/>
-          <w:bCs/>
-        </w:rPr>
-        <w:t>Year 3</w:t>
-      </w:r>
-    </w:p>
-    <w:p>
-      <w:pPr>
-        <w:rPr>
-          <w:rFonts w:ascii="Segoe UI Emoji" w:hAnsi="Segoe UI Emoji" w:cs="Segoe UI Emoji"/>
-          <w:b/>
-          <w:bCs/>
-        </w:rPr>
-      </w:pPr>
-      <w:r>
-        <w:rPr>
-          <w:rFonts w:ascii="Segoe UI Emoji" w:hAnsi="Segoe UI Emoji" w:cs="Segoe UI Emoji"/>
-          <w:b/>
-          <w:bCs/>
-        </w:rPr>
-        <w:t>Publish deeper frameworks and patterns.</w:t>
-      </w:r>
-    </w:p>
-    <w:p>
-      <w:pPr>
-        <w:rPr>
-          <w:rFonts w:ascii="Segoe UI Emoji" w:hAnsi="Segoe UI Emoji" w:cs="Segoe UI Emoji"/>
-          <w:b/>
-          <w:bCs/>
-        </w:rPr>
-      </w:pPr>
-      <w:r>
-        <w:rPr>
-          <w:rFonts w:ascii="Segoe UI Emoji" w:hAnsi="Segoe UI Emoji" w:cs="Segoe UI Emoji"/>
-          <w:b/>
-          <w:bCs/>
-        </w:rPr>
-        <w:t>Year 4</w:t>
-      </w:r>
-    </w:p>
-    <w:p>
-      <w:pPr>
-        <w:rPr>
-          <w:rFonts w:ascii="Segoe UI Emoji" w:hAnsi="Segoe UI Emoji" w:cs="Segoe UI Emoji"/>
-          <w:b/>
-          <w:bCs/>
-        </w:rPr>
-      </w:pPr>
-      <w:r>
-        <w:rPr>
-          <w:rFonts w:ascii="Segoe UI Emoji" w:hAnsi="Segoe UI Emoji" w:cs="Segoe UI Emoji"/>
-          <w:b/>
-          <w:bCs/>
-        </w:rPr>
-        <w:t>Introduce research-backed prototypes or products.</w:t>
-      </w:r>
-    </w:p>
-    <w:p>
-      <w:pPr>
-        <w:rPr>
-          <w:rFonts w:ascii="Segoe UI Emoji" w:hAnsi="Segoe UI Emoji" w:cs="Segoe UI Emoji"/>
-          <w:b/>
-          <w:bCs/>
-        </w:rPr>
-      </w:pPr>
-      <w:r>
-        <w:rPr>
-          <w:rFonts w:ascii="Segoe UI Emoji" w:hAnsi="Segoe UI Emoji" w:cs="Segoe UI Emoji"/>
-          <w:b/>
-          <w:bCs/>
-        </w:rPr>
-        <w:pict w14:anchorId="32F8708A">
-          <v:rect id="_x0000_i1167" style="width:0;height:1.5pt" o:hralign="center" o:hrstd="t" o:hr="t" fillcolor="#a0a0a0" stroked="f"/>
-        </w:pict>
-      </w:r>
-    </w:p>
-    <w:p>
-      <w:pPr>
-        <w:rPr>
-          <w:rFonts w:ascii="Segoe UI Emoji" w:hAnsi="Segoe UI Emoji" w:cs="Segoe UI Emoji"/>
-          <w:b/>
-          <w:bCs/>
-        </w:rPr>
-      </w:pPr>
-      <w:r>
-        <w:rPr>
-          <w:rFonts w:ascii="Segoe UI Emoji" w:hAnsi="Segoe UI Emoji" w:cs="Segoe UI Emoji"/>
-          <w:b/>
-          <w:bCs/>
-        </w:rPr>
-        <w:t>17. Success Metrics</w:t>
-      </w:r>
-    </w:p>
-    <w:p>
-      <w:pPr>
-        <w:rPr>
-          <w:rFonts w:ascii="Segoe UI Emoji" w:hAnsi="Segoe UI Emoji" w:cs="Segoe UI Emoji"/>
-          <w:b/>
-          <w:bCs/>
-        </w:rPr>
-      </w:pPr>
-      <w:r>
-        <w:rPr>
-          <w:rFonts w:ascii="Segoe UI Emoji" w:hAnsi="Segoe UI Emoji" w:cs="Segoe UI Emoji"/>
-          <w:b/>
-          <w:bCs/>
-        </w:rPr>
-        <w:t>Rather than measuring only likes or followers, consider:</w:t>
-      </w:r>
-    </w:p>
-    <w:p>
-      <w:pPr>
-        <w:numPr>
-          <w:ilvl w:val="0"/>
-          <w:numId w:val="28"/>
-        </w:numPr>
-        <w:rPr>
-          <w:rFonts w:ascii="Segoe UI Emoji" w:hAnsi="Segoe UI Emoji" w:cs="Segoe UI Emoji"/>
-          <w:b/>
-          <w:bCs/>
-        </w:rPr>
-      </w:pPr>
-      <w:r>
-        <w:rPr>
-          <w:rFonts w:ascii="Segoe UI Emoji" w:hAnsi="Segoe UI Emoji" w:cs="Segoe UI Emoji"/>
-          <w:b/>
-          <w:bCs/>
-        </w:rPr>
-        <w:t xml:space="preserve">Are discussions becoming more thoughtful? </w:t>
-      </w:r>
-    </w:p>
-    <w:p>
-      <w:pPr>
-        <w:numPr>
-          <w:ilvl w:val="0"/>
-          <w:numId w:val="28"/>
-        </w:numPr>
-        <w:rPr>
-          <w:rFonts w:ascii="Segoe UI Emoji" w:hAnsi="Segoe UI Emoji" w:cs="Segoe UI Emoji"/>
-          <w:b/>
-          <w:bCs/>
-        </w:rPr>
-      </w:pPr>
-      <w:r>
-        <w:rPr>
-          <w:rFonts w:ascii="Segoe UI Emoji" w:hAnsi="Segoe UI Emoji" w:cs="Segoe UI Emoji"/>
-          <w:b/>
-          <w:bCs/>
-        </w:rPr>
-        <w:t xml:space="preserve">Are people sharing their own observations? </w:t>
-      </w:r>
-    </w:p>
-    <w:p>
-      <w:pPr>
-        <w:numPr>
-          <w:ilvl w:val="0"/>
-          <w:numId w:val="28"/>
-        </w:numPr>
-        <w:rPr>
-          <w:rFonts w:ascii="Segoe UI Emoji" w:hAnsi="Segoe UI Emoji" w:cs="Segoe UI Emoji"/>
-          <w:b/>
-          <w:bCs/>
-        </w:rPr>
-      </w:pPr>
-      <w:r>
-        <w:rPr>
-          <w:rFonts w:ascii="Segoe UI Emoji" w:hAnsi="Segoe UI Emoji" w:cs="Segoe UI Emoji"/>
-          <w:b/>
-          <w:bCs/>
-        </w:rPr>
-        <w:t xml:space="preserve">Are professionals engaging with the research? </w:t>
-      </w:r>
-    </w:p>
-    <w:p>
-      <w:pPr>
-        <w:numPr>
-          <w:ilvl w:val="0"/>
-          <w:numId w:val="28"/>
-        </w:numPr>
-        <w:rPr>
-          <w:rFonts w:ascii="Segoe UI Emoji" w:hAnsi="Segoe UI Emoji" w:cs="Segoe UI Emoji"/>
-          <w:b/>
-          <w:bCs/>
-        </w:rPr>
-      </w:pPr>
-      <w:r>
-        <w:rPr>
-          <w:rFonts w:ascii="Segoe UI Emoji" w:hAnsi="Segoe UI Emoji" w:cs="Segoe UI Emoji"/>
-          <w:b/>
-          <w:bCs/>
-        </w:rPr>
-        <w:t xml:space="preserve">Is the Atlas knowledge base growing? </w:t>
-      </w:r>
-    </w:p>
-    <w:p>
-      <w:pPr>
-        <w:numPr>
-          <w:ilvl w:val="0"/>
-          <w:numId w:val="28"/>
-        </w:numPr>
-        <w:rPr>
-          <w:rFonts w:ascii="Segoe UI Emoji" w:hAnsi="Segoe UI Emoji" w:cs="Segoe UI Emoji"/>
-          <w:b/>
-          <w:bCs/>
-        </w:rPr>
-      </w:pPr>
-      <w:r>
-        <w:rPr>
-          <w:rFonts w:ascii="Segoe UI Emoji" w:hAnsi="Segoe UI Emoji" w:cs="Segoe UI Emoji"/>
-          <w:b/>
-          <w:bCs/>
-        </w:rPr>
-        <w:t xml:space="preserve">Is Project UIL becoming associated with observation-driven thinking? </w:t>
-      </w:r>
-    </w:p>
-    <w:p>
-      <w:pPr>
-        <w:rPr>
-          <w:rFonts w:ascii="Segoe UI Emoji" w:hAnsi="Segoe UI Emoji" w:cs="Segoe UI Emoji"/>
-          <w:b/>
-          <w:bCs/>
-        </w:rPr>
-      </w:pPr>
-      <w:r>
-        <w:rPr>
-          <w:rFonts w:ascii="Segoe UI Emoji" w:hAnsi="Segoe UI Emoji" w:cs="Segoe UI Emoji"/>
-          <w:b/>
-          <w:bCs/>
-        </w:rPr>
-        <w:t>These indicators better reflect the project's purpose.</w:t>
-      </w:r>
-    </w:p>
-    <w:p>
-      <w:pPr>
-        <w:rPr>
-          <w:rFonts w:ascii="Segoe UI Emoji" w:hAnsi="Segoe UI Emoji" w:cs="Segoe UI Emoji"/>
-          <w:b/>
-          <w:bCs/>
-        </w:rPr>
-      </w:pPr>
-      <w:r>
-        <w:rPr>
-          <w:rFonts w:ascii="Segoe UI Emoji" w:hAnsi="Segoe UI Emoji" w:cs="Segoe UI Emoji"/>
-          <w:b/>
-          <w:bCs/>
-        </w:rPr>
-        <w:pict w14:anchorId="00023A60">
-          <v:rect id="_x0000_i1168" style="width:0;height:1.5pt" o:hralign="center" o:hrstd="t" o:hr="t" fillcolor="#a0a0a0" stroked="f"/>
-        </w:pict>
-      </w:r>
-    </w:p>
-    <w:p>
-      <w:pPr>
-        <w:rPr>
-          <w:rFonts w:ascii="Segoe UI Emoji" w:hAnsi="Segoe UI Emoji" w:cs="Segoe UI Emoji"/>
-          <w:b/>
-          <w:bCs/>
-        </w:rPr>
-      </w:pPr>
-      <w:r>
-        <w:rPr>
-          <w:rFonts w:ascii="Segoe UI Emoji" w:hAnsi="Segoe UI Emoji" w:cs="Segoe UI Emoji"/>
-          <w:b/>
-          <w:bCs/>
-        </w:rPr>
-        <w:t>18. Final Publishing Principle</w:t>
-      </w:r>
-    </w:p>
-    <w:p>
-      <w:pPr>
-        <w:rPr>
-          <w:rFonts w:ascii="Segoe UI Emoji" w:hAnsi="Segoe UI Emoji" w:cs="Segoe UI Emoji"/>
-          <w:b/>
-          <w:bCs/>
-        </w:rPr>
-      </w:pPr>
-      <w:r>
-        <w:rPr>
-          <w:rFonts w:ascii="Segoe UI Emoji" w:hAnsi="Segoe UI Emoji" w:cs="Segoe UI Emoji"/>
-          <w:b/>
-          <w:bCs/>
-        </w:rPr>
-        <w:t>Every post should leave the reader with a clearer understanding of a human problem or a better question to explore—not simply another piece of content to scroll past.</w:t>
-      </w:r>
-    </w:p>
     <w:p>
       <w:pPr>
         <w:rPr>
@@ -4066,7 +43,7 @@
     <w:p>
       <w:r>
         <w:pict w14:anchorId="321E48AC">
-          <v:rect id="_x0000_i1025" style="width:0;height:1.5pt" o:hralign="center" o:hrstd="t" o:hr="t" fillcolor="#a0a0a0" stroked="f"/>
+          <v:rect id="_x0000_i1043" style="width:0;height:1.5pt" o:hralign="center" o:hrstd="t" o:hr="t" fillcolor="#a0a0a0" stroked="f"/>
         </w:pict>
       </w:r>
     </w:p>
@@ -4103,7 +80,7 @@
     <w:p>
       <w:r>
         <w:pict w14:anchorId="4ED6B837">
-          <v:rect id="_x0000_i1026" style="width:0;height:1.5pt" o:hralign="center" o:hrstd="t" o:hr="t" fillcolor="#a0a0a0" stroked="f"/>
+          <v:rect id="_x0000_i1044" style="width:0;height:1.5pt" o:hralign="center" o:hrstd="t" o:hr="t" fillcolor="#a0a0a0" stroked="f"/>
         </w:pict>
       </w:r>
     </w:p>
@@ -4144,7 +121,7 @@
     <w:p>
       <w:r>
         <w:pict w14:anchorId="1E65E5A2">
-          <v:rect id="_x0000_i1027" style="width:0;height:1.5pt" o:hralign="center" o:hrstd="t" o:hr="t" fillcolor="#a0a0a0" stroked="f"/>
+          <v:rect id="_x0000_i1045" style="width:0;height:1.5pt" o:hralign="center" o:hrstd="t" o:hr="t" fillcolor="#a0a0a0" stroked="f"/>
         </w:pict>
       </w:r>
     </w:p>
@@ -4290,7 +267,7 @@
     <w:p>
       <w:r>
         <w:pict w14:anchorId="46272E8D">
-          <v:rect id="_x0000_i1028" style="width:0;height:1.5pt" o:hralign="center" o:hrstd="t" o:hr="t" fillcolor="#a0a0a0" stroked="f"/>
+          <v:rect id="_x0000_i1046" style="width:0;height:1.5pt" o:hralign="center" o:hrstd="t" o:hr="t" fillcolor="#a0a0a0" stroked="f"/>
         </w:pict>
       </w:r>
     </w:p>
@@ -4710,7 +687,7 @@
     <w:p>
       <w:r>
         <w:pict w14:anchorId="6831A1A0">
-          <v:rect id="_x0000_i1029" style="width:0;height:1.5pt" o:hralign="center" o:hrstd="t" o:hr="t" fillcolor="#a0a0a0" stroked="f"/>
+          <v:rect id="_x0000_i1047" style="width:0;height:1.5pt" o:hralign="center" o:hrstd="t" o:hr="t" fillcolor="#a0a0a0" stroked="f"/>
         </w:pict>
       </w:r>
     </w:p>
@@ -4792,7 +769,7 @@
     <w:p>
       <w:r>
         <w:pict w14:anchorId="53125F20">
-          <v:rect id="_x0000_i1030" style="width:0;height:1.5pt" o:hralign="center" o:hrstd="t" o:hr="t" fillcolor="#a0a0a0" stroked="f"/>
+          <v:rect id="_x0000_i1048" style="width:0;height:1.5pt" o:hralign="center" o:hrstd="t" o:hr="t" fillcolor="#a0a0a0" stroked="f"/>
         </w:pict>
       </w:r>
     </w:p>
@@ -4920,7 +897,7 @@
     <w:p>
       <w:r>
         <w:pict w14:anchorId="02D82CF7">
-          <v:rect id="_x0000_i1031" style="width:0;height:1.5pt" o:hralign="center" o:hrstd="t" o:hr="t" fillcolor="#a0a0a0" stroked="f"/>
+          <v:rect id="_x0000_i1049" style="width:0;height:1.5pt" o:hralign="center" o:hrstd="t" o:hr="t" fillcolor="#a0a0a0" stroked="f"/>
         </w:pict>
       </w:r>
     </w:p>
@@ -5084,7 +1061,7 @@
     <w:p>
       <w:r>
         <w:pict w14:anchorId="3A41A725">
-          <v:rect id="_x0000_i1032" style="width:0;height:1.5pt" o:hralign="center" o:hrstd="t" o:hr="t" fillcolor="#a0a0a0" stroked="f"/>
+          <v:rect id="_x0000_i1050" style="width:0;height:1.5pt" o:hralign="center" o:hrstd="t" o:hr="t" fillcolor="#a0a0a0" stroked="f"/>
         </w:pict>
       </w:r>
     </w:p>
@@ -5221,7 +1198,7 @@
     <w:p>
       <w:r>
         <w:pict w14:anchorId="03B5FEC1">
-          <v:rect id="_x0000_i1033" style="width:0;height:1.5pt" o:hralign="center" o:hrstd="t" o:hr="t" fillcolor="#a0a0a0" stroked="f"/>
+          <v:rect id="_x0000_i1051" style="width:0;height:1.5pt" o:hralign="center" o:hrstd="t" o:hr="t" fillcolor="#a0a0a0" stroked="f"/>
         </w:pict>
       </w:r>
     </w:p>
@@ -5319,7 +1296,7 @@
     <w:p>
       <w:r>
         <w:pict w14:anchorId="77FAE117">
-          <v:rect id="_x0000_i1034" style="width:0;height:1.5pt" o:hralign="center" o:hrstd="t" o:hr="t" fillcolor="#a0a0a0" stroked="f"/>
+          <v:rect id="_x0000_i1052" style="width:0;height:1.5pt" o:hralign="center" o:hrstd="t" o:hr="t" fillcolor="#a0a0a0" stroked="f"/>
         </w:pict>
       </w:r>
     </w:p>
@@ -5401,7 +1378,7 @@
     <w:p>
       <w:r>
         <w:pict w14:anchorId="6E9A2B49">
-          <v:rect id="_x0000_i1035" style="width:0;height:1.5pt" o:hralign="center" o:hrstd="t" o:hr="t" fillcolor="#a0a0a0" stroked="f"/>
+          <v:rect id="_x0000_i1053" style="width:0;height:1.5pt" o:hralign="center" o:hrstd="t" o:hr="t" fillcolor="#a0a0a0" stroked="f"/>
         </w:pict>
       </w:r>
     </w:p>
@@ -5511,7 +1488,7 @@
     <w:p>
       <w:r>
         <w:pict w14:anchorId="2B7B7A25">
-          <v:rect id="_x0000_i1036" style="width:0;height:1.5pt" o:hralign="center" o:hrstd="t" o:hr="t" fillcolor="#a0a0a0" stroked="f"/>
+          <v:rect id="_x0000_i1054" style="width:0;height:1.5pt" o:hralign="center" o:hrstd="t" o:hr="t" fillcolor="#a0a0a0" stroked="f"/>
         </w:pict>
       </w:r>
     </w:p>
@@ -5558,7 +1535,7 @@
     <w:p>
       <w:r>
         <w:pict w14:anchorId="3B09A333">
-          <v:rect id="_x0000_i1037" style="width:0;height:1.5pt" o:hralign="center" o:hrstd="t" o:hr="t" fillcolor="#a0a0a0" stroked="f"/>
+          <v:rect id="_x0000_i1055" style="width:0;height:1.5pt" o:hralign="center" o:hrstd="t" o:hr="t" fillcolor="#a0a0a0" stroked="f"/>
         </w:pict>
       </w:r>
     </w:p>
@@ -5671,7 +1648,7 @@
     <w:p>
       <w:r>
         <w:pict w14:anchorId="7BC6B97C">
-          <v:rect id="_x0000_i1038" style="width:0;height:1.5pt" o:hralign="center" o:hrstd="t" o:hr="t" fillcolor="#a0a0a0" stroked="f"/>
+          <v:rect id="_x0000_i1056" style="width:0;height:1.5pt" o:hralign="center" o:hrstd="t" o:hr="t" fillcolor="#a0a0a0" stroked="f"/>
         </w:pict>
       </w:r>
     </w:p>
@@ -5774,7 +1751,7 @@
     <w:p>
       <w:r>
         <w:pict w14:anchorId="11C6C1B6">
-          <v:rect id="_x0000_i1039" style="width:0;height:1.5pt" o:hralign="center" o:hrstd="t" o:hr="t" fillcolor="#a0a0a0" stroked="f"/>
+          <v:rect id="_x0000_i1057" style="width:0;height:1.5pt" o:hralign="center" o:hrstd="t" o:hr="t" fillcolor="#a0a0a0" stroked="f"/>
         </w:pict>
       </w:r>
     </w:p>
@@ -5901,7 +1878,7 @@
       <w:r>
         <w:lastRenderedPageBreak/>
         <w:pict w14:anchorId="110219BE">
-          <v:rect id="_x0000_i1040" style="width:0;height:1.5pt" o:hralign="center" o:hrstd="t" o:hr="t" fillcolor="#a0a0a0" stroked="f"/>
+          <v:rect id="_x0000_i1058" style="width:0;height:1.5pt" o:hralign="center" o:hrstd="t" o:hr="t" fillcolor="#a0a0a0" stroked="f"/>
         </w:pict>
       </w:r>
     </w:p>
@@ -6003,7 +1980,7 @@
     <w:p>
       <w:r>
         <w:pict w14:anchorId="18A25176">
-          <v:rect id="_x0000_i1041" style="width:0;height:1.5pt" o:hralign="center" o:hrstd="t" o:hr="t" fillcolor="#a0a0a0" stroked="f"/>
+          <v:rect id="_x0000_i1059" style="width:0;height:1.5pt" o:hralign="center" o:hrstd="t" o:hr="t" fillcolor="#a0a0a0" stroked="f"/>
         </w:pict>
       </w:r>
     </w:p>
@@ -6090,7 +2067,7 @@
     <w:p>
       <w:r>
         <w:pict w14:anchorId="261BE1A1">
-          <v:rect id="_x0000_i1042" style="width:0;height:1.5pt" o:hralign="center" o:hrstd="t" o:hr="t" fillcolor="#a0a0a0" stroked="f"/>
+          <v:rect id="_x0000_i1060" style="width:0;height:1.5pt" o:hralign="center" o:hrstd="t" o:hr="t" fillcolor="#a0a0a0" stroked="f"/>
         </w:pict>
       </w:r>
     </w:p>
@@ -10993,6 +6970,7 @@
   <w:style w:type="character" w:default="1" w:styleId="DefaultParagraphFont">
     <w:name w:val="Default Paragraph Font"/>
     <w:uiPriority w:val="1"/>
+    <w:semiHidden/>
     <w:unhideWhenUsed/>
   </w:style>
   <w:style w:type="table" w:default="1" w:styleId="TableNormal">

</xml_diff>